<commit_message>
Add offline/submission setup (no Google credentials needed)
- sample_emails.json: full synthetic email set (27 msgs) with personal
  addresses anonymized -> agent runs fully offline in manual mode.
- SUBMISSION.md: run guide for organizers (manual mode, temp LLM key, no
  credentials.json / gmail_token.pkl required).
- .env.example: default DATA_SOURCE_MODE=manual for submission/demo.
- Regenerated Report_Sample outputs from the offline run.

Verified: DATA_SOURCE_MODE=manual produces the full .docx report (all 7
initiatives updated from sample_emails.json) with no Gmail access.

Co-Authored-By: Claude Opus 4.8 (1M context) <noreply@anthropic.com>
</commit_message>
<xml_diff>
--- a/Report_Sample/Report/Report thang 6 nam 2026.docx
+++ b/Report_Sample/Report/Report thang 6 nam 2026.docx
@@ -1501,7 +1501,7 @@
         <w:t xml:space="preserve">Read: </w:t>
       </w:r>
       <w:r>
-        <w:t>User base grew +5% MoM to 67k, tracking on plan. Eligible base expanded +5% to 23k, maintaining 35% penetration. Traffic surged +38% to 10k driven by conversion uplift, though disbursement missed plan by -8% due to approval rate shortfall.</w:t>
+        <w:t>June disbursement reached VNDm 98,596, up 38% MoM driven by a 38% surge in traffic and approvals, though remaining 8% below plan due to a 5pp shortfall in approval rates. The eligible base and ticket size remained stable, while traffic conversion to eligible users improved by 10pp.</w:t>
       </w:r>
     </w:p>
     <w:p>
@@ -1527,7 +1527,7 @@
         <w:t xml:space="preserve">Headline. </w:t>
       </w:r>
       <w:r>
-        <w:t>Disbursement reached VNDm 98,596 (+38% MoM) but missed June plan by -8% (VNDm 107,191). Growth was volume-driven via traffic expansion, offset by a 5pp approval rate gap versus plan.</w:t>
+        <w:t>Disbursement grew 38% MoM to VNDm 98,596, missing the June plan by 8% primarily due to a 5pp approval rate gap despite traffic and eligible base performing on plan.</w:t>
       </w:r>
     </w:p>
     <w:p>
@@ -1541,7 +1541,7 @@
         <w:t xml:space="preserve">MoM bridge (fact). </w:t>
       </w:r>
       <w:r>
-        <w:t>Disbursement +38% decomposed into Eligible Base x1.05 and Traffic Conversion x1.31 (32% to 42%); 1.05 x 1.31 ~= 1.37, i.e. +37% growth. Submission rate, approval rate, and ticket size remained flat MoM.</w:t>
+        <w:t>Growth decomposes into Eligible Base x1.05 and Approval Rate x1.00 (stable), but driven by Traffic/Eligible x1.31 (32% to 42%) and Submission/Traffic x1.00; 1.05 x 1.31 x 1.00 x 1.00 ~= 1.38, i.e. +38%.</w:t>
       </w:r>
     </w:p>
     <w:p>
@@ -1555,7 +1555,7 @@
         <w:t xml:space="preserve">Plan-miss bridge (fact). </w:t>
       </w:r>
       <w:r>
-        <w:t>-8% gap driven by Approval Rate -5pp (65% actual vs 70% plan) and Eligible Base -4% (23k vs 24k plan). Traffic and Ticket Size met plan targets.</w:t>
+        <w:t>The 8% miss vs plan (VNDm 107,191) is fully attributed to the Approval Rate gap of -5pp (actual 65% vs plan 70%), as Traffic, Eligible Base, and Ticket Size all met or exceeded targets.</w:t>
       </w:r>
     </w:p>
     <w:p>
@@ -1576,7 +1576,7 @@
         <w:pStyle w:val="ListBullet"/>
       </w:pPr>
       <w:r>
-        <w:t>Initiative #1.0 (Thư. Trần Thị (2), Live): Partner integration maintained Eligible Base growth (+5%) but failed to lift %Eligible/Total beyond 35% plan, limiting structural ceiling.</w:t>
+        <w:t>Eligible Base: Stable at 35% of total users; Initiative #1.0 (Persona 1) live since 7/6 delivered expected uplift, but Initiative #2.0 (Persona 1) delayed to Oct-26 due to missing API risk-based pricing scope.</w:t>
       </w:r>
     </w:p>
     <w:p>
@@ -1584,7 +1584,7 @@
         <w:pStyle w:val="ListBullet"/>
       </w:pPr>
       <w:r>
-        <w:t>Initiative #3.0 (Thư Trần, On Track): Scoring model v1 Gini lower than expected (0.2 vs 0.4); optimization ongoing for Sep-26 launch to unlock approval rate potential.</w:t>
+        <w:t>Approval Rate: Missed plan by 5pp; Initiative #3.0 (Persona 2) remains on track for Sep-26 but current model v1 Gini scores are below expectations, limiting immediate scoring improvements.</w:t>
       </w:r>
     </w:p>
     <w:p>
@@ -1605,7 +1605,7 @@
         <w:pStyle w:val="ListBullet"/>
       </w:pPr>
       <w:r>
-        <w:t>Initiative #4.0 (Thư. Trần Thị (2), Live): New product deployment drove %Traffic/Eligible +10pp (32% to 42%), accounting for majority of MoM volume growth.</w:t>
+        <w:t>Traffic/Eligible: Exceeded plan by 10pp (42% vs 35%); Initiative #4.0 (Persona 3) live since 7/6 successfully unlocked new demand, while Initiative #6.0 (Persona 3) contributed incremental channel traffic.</w:t>
       </w:r>
     </w:p>
     <w:p>
@@ -1613,7 +1613,7 @@
         <w:pStyle w:val="ListBullet"/>
       </w:pPr>
       <w:r>
-        <w:t>Initiative #9.0 (Persona 1, Live): Product diversification maintained Average Ticket Size at VNDm 110, meeting plan but offering no incremental upside.</w:t>
+        <w:t>Submission/Traffic: Met plan at 14%; Initiatives #8.0 and #9.0 (Persona 1) live since Feb/Mar-26 maintained conversion stability despite traffic volume increases.</w:t>
       </w:r>
     </w:p>
     <w:p>
@@ -1639,7 +1639,7 @@
         <w:t xml:space="preserve">Run-rate. </w:t>
       </w:r>
       <w:r>
-        <w:t>July disbursement run-rate projected at VNDm 103,525 (+5% vs June actual), representing a significant -23% gap to July plan (VNDm 134,754).</w:t>
+        <w:t>July disbursement run-rate is projected at VNDm 103,525 (+5% MoM), yet remains 23% below the July plan of VNDm 134,754 due to persistent approval rate constraints.</w:t>
       </w:r>
     </w:p>
     <w:p>
@@ -1660,7 +1660,7 @@
         <w:pStyle w:val="ListBullet"/>
       </w:pPr>
       <w:r>
-        <w:t>No structural approval rate improvements expected in July; Initiative #3.0 modelling launch remains scheduled for Sep-26.</w:t>
+        <w:t>Approval Rate: No immediate structural unlock expected in July; reliance on Initiative #3.0 (Persona 2) optimization remains critical for Sep-26 delivery.</w:t>
       </w:r>
     </w:p>
     <w:p>
@@ -1681,7 +1681,7 @@
         <w:pStyle w:val="ListBullet"/>
       </w:pPr>
       <w:r>
-        <w:t>Traffic momentum may soften without new channels; Initiative #7.0 deprioritized until Q4-2026 due to resource constraints.</w:t>
+        <w:t>Traffic: Initiative #7.0 (Persona 3) deprioritized to Q4-26 due to Cashier team capacity constraints, limiting potential +2pp traffic uplift in July.</w:t>
       </w:r>
     </w:p>
     <w:p>
@@ -1817,7 +1817,7 @@
               <w:rPr>
                 <w:sz w:val="17"/>
               </w:rPr>
-              <w:t>Initiative #3.0 (Thư Trần)</w:t>
+              <w:t>Initiative #3.0 (Persona 2)</w:t>
             </w:r>
           </w:p>
         </w:tc>
@@ -1831,7 +1831,7 @@
               <w:rPr>
                 <w:sz w:val="17"/>
               </w:rPr>
-              <w:t>Accelerate model optimization to close 5pp approval gap before Sep-26 launch to protect FY volume.</w:t>
+              <w:t>Close the 5pp gap to plan by optimizing model v1 Gini scores before Sep-26 launch to unlock disbursement volume.</w:t>
             </w:r>
           </w:p>
         </w:tc>
@@ -1861,7 +1861,7 @@
               <w:rPr>
                 <w:sz w:val="17"/>
               </w:rPr>
-              <w:t>Incremental — Traffic Sustainment</w:t>
+              <w:t>Structural — Eligible Base Expansion</w:t>
             </w:r>
           </w:p>
         </w:tc>
@@ -1875,7 +1875,7 @@
               <w:rPr>
                 <w:sz w:val="17"/>
               </w:rPr>
-              <w:t>Initiative #4.0 (Thư. Trần Thị (2))</w:t>
+              <w:t>Initiative #2.0 (Persona 1)</w:t>
             </w:r>
           </w:p>
         </w:tc>
@@ -1889,7 +1889,7 @@
               <w:rPr>
                 <w:sz w:val="17"/>
               </w:rPr>
-              <w:t>Maintain 42% traffic conversion post-launch to prevent July run-rate decay.</w:t>
+              <w:t>Resolve API risk-based pricing scope to avoid further delays beyond Oct-26, targeting +10pp eligible base uplift.</w:t>
             </w:r>
           </w:p>
         </w:tc>
@@ -2027,7 +2027,7 @@
               <w:rPr>
                 <w:sz w:val="17"/>
               </w:rPr>
-              <w:t>Initiative #1.0 Live; Initiative #2.0 Delayed to Oct-26</w:t>
+              <w:t>Initiative #1.0 landed (+10pp); Initiative #2.0 delayed to Oct-26; Initiative #3.0 on track for Sep-26 (+15pp).</w:t>
             </w:r>
           </w:p>
         </w:tc>
@@ -2071,7 +2071,7 @@
               <w:rPr>
                 <w:sz w:val="17"/>
               </w:rPr>
-              <w:t>Scoring Models</w:t>
+              <w:t>Approval Rate Optimization</w:t>
             </w:r>
           </w:p>
         </w:tc>
@@ -2085,7 +2085,7 @@
               <w:rPr>
                 <w:sz w:val="17"/>
               </w:rPr>
-              <w:t>Initiative #3.0 On Track for Sep-26</w:t>
+              <w:t>Current model underperforming; new scoring model (Initiative #3.0) pending Sep-26.</w:t>
             </w:r>
           </w:p>
         </w:tc>
@@ -2239,7 +2239,7 @@
               <w:rPr>
                 <w:sz w:val="17"/>
               </w:rPr>
-              <w:t>Initiative #4.0 Landed; Initiative #7.0 Deprioritized</w:t>
+              <w:t>Initiative #4.0 landed (+10pp); Initiative #7.0 deprioritized to Q4.</w:t>
             </w:r>
           </w:p>
         </w:tc>
@@ -2253,7 +2253,7 @@
               <w:rPr>
                 <w:sz w:val="17"/>
               </w:rPr>
-              <w:t>+10pp</w:t>
+              <w:t>+10pp (landed)</w:t>
             </w:r>
           </w:p>
         </w:tc>
@@ -2283,7 +2283,7 @@
               <w:rPr>
                 <w:sz w:val="17"/>
               </w:rPr>
-              <w:t>Conversion Efficiency</w:t>
+              <w:t>Conversion Optimization</w:t>
             </w:r>
           </w:p>
         </w:tc>
@@ -2297,7 +2297,7 @@
               <w:rPr>
                 <w:sz w:val="17"/>
               </w:rPr>
-              <w:t>Initiative #9.0 Live; Initiative #10.0 Delayed</w:t>
+              <w:t>Initiatives #8.0 and #9.0 live; Initiative #10.0 delayed.</w:t>
             </w:r>
           </w:p>
         </w:tc>
@@ -2311,7 +2311,7 @@
               <w:rPr>
                 <w:sz w:val="17"/>
               </w:rPr>
-              <w:t>Flat</w:t>
+              <w:t>+4pp (landed)</w:t>
             </w:r>
           </w:p>
         </w:tc>
@@ -2325,7 +2325,7 @@
               <w:rPr>
                 <w:sz w:val="17"/>
               </w:rPr>
-              <w:t>Stable</w:t>
+              <w:t>On track</w:t>
             </w:r>
           </w:p>
         </w:tc>
@@ -2352,7 +2352,7 @@
         <w:rPr>
           <w:b w:val="0"/>
         </w:rPr>
-        <w:t>YTD Disbursement at VNDm 277,174 vs Plan VNDm 339,865 (-18% gap). To hit FY plan of VNDm 1,879,405, requires aggressive catch-up in H2 contingent on Initiative #3.0 delivering approval rate uplift and Initiative #2.0 launching on time in Oct-26.</w:t>
+        <w:t>YTD disbursement stands at VNDm 277,174, missing the plan of VNDm 339,865 by 18%. To hit the FY plan of VNDm 1,879,405, the business must recover the approval rate gap via Initiative #3.0 in Q3 and accelerate Initiative #2.0 to Q4, assuming traffic growth remains stable.</w:t>
       </w:r>
     </w:p>
     <w:p>
@@ -2373,7 +2373,7 @@
         <w:pStyle w:val="ListBullet"/>
       </w:pPr>
       <w:r>
-        <w:t>Initiative #2.0 (Partner Risk Appetite) delayed 6-8 weeks due to API support requirements; threatens Q4 eligible base targets.</w:t>
+        <w:t>Initiative #2.0 (Persona 1): High risk of further delay beyond Oct-26 if API risk-based pricing scope is not resolved, threatening eligible base targets.</w:t>
       </w:r>
     </w:p>
     <w:p>
@@ -2381,7 +2381,15 @@
         <w:pStyle w:val="ListBullet"/>
       </w:pPr>
       <w:r>
-        <w:t>Initiative #3.0 (Modelling) Gini score underperformance risks missing Sep-26 approval rate targets, exacerbating YTD shortfall.</w:t>
+        <w:t>Initiative #3.0 (Persona 2): Medium risk that model v1 optimization fails to meet Gini expectations, delaying the Sep-26 launch and approval rate recovery.</w:t>
+      </w:r>
+    </w:p>
+    <w:p>
+      <w:pPr>
+        <w:pStyle w:val="ListBullet"/>
+      </w:pPr>
+      <w:r>
+        <w:t>Initiative #10.0 (Persona 2): Low confidence in July start due to DS team prioritization conflicts, risking submission rate stagnation.</w:t>
       </w:r>
     </w:p>
     <w:sectPr>

</xml_diff>

<commit_message>
Lock-resilient Excel writes + refresh sample outputs
- excel_io.save_sheet: on PermissionError (workbook open in Excel) fall back to
  "<name> (n).xlsx" instead of skipping; used by Step 3 (Performance analysis)
  and Step 4 (Forecast). tracker_writer gets the same fallback.
- Refresh Report_Sample outputs from the latest live run (report .docx now shows
  Movement check, Escalations and the new analysis).

Co-Authored-By: Claude Opus 4.8 (1M context) <noreply@anthropic.com>
</commit_message>
<xml_diff>
--- a/Report_Sample/Report/Report thang 6 nam 2026.docx
+++ b/Report_Sample/Report/Report thang 6 nam 2026.docx
@@ -1501,7 +1501,21 @@
         <w:t xml:space="preserve">Read: </w:t>
       </w:r>
       <w:r>
-        <w:t>June disbursement reached VNDm 98,596, up 38% MoM driven by a 38% surge in traffic and approvals, though remaining 8% below plan due to a 5pp shortfall in approval rates. The eligible base and ticket size remained stable, while traffic conversion to eligible users improved by 10pp.</w:t>
+        <w:t>June 2026 disbursement volume reached VNDm 98,596, a +38% MoM increase driven by a 38% rise in traffic and approvals, though the month closed -8% vs plan due to a 5pp shortfall in approval rates. The eligible base grew mechanically by 5% in line with total user base expansion, while traffic conversion to eligible users improved by 10pp.</w:t>
+      </w:r>
+    </w:p>
+    <w:p>
+      <w:pPr>
+        <w:spacing w:after="80"/>
+      </w:pPr>
+      <w:r>
+        <w:rPr>
+          <w:b/>
+        </w:rPr>
+        <w:t xml:space="preserve">Movement check: </w:t>
+      </w:r>
+      <w:r>
+        <w:t>Eligible Base For Cash Loan +5% — MECHANICAL (base-driven; %Eligible/Total User Base flat). Traffic to Landing Page — REAL (%Traffic/Eligible +10pp). Submission +38% — MECHANICAL (base-driven; %Submission/Traffic flat). Approved +38% — MECHANICAL (base-driven; %Approval Rate flat).</w:t>
       </w:r>
     </w:p>
     <w:p>
@@ -1527,7 +1541,7 @@
         <w:t xml:space="preserve">Headline. </w:t>
       </w:r>
       <w:r>
-        <w:t>Disbursement grew 38% MoM to VNDm 98,596, missing the June plan by 8% primarily due to a 5pp approval rate gap despite traffic and eligible base performing on plan.</w:t>
+        <w:t>June disbursement volume hit VNDm 98,596 (+38% MoM) but missed the VNDm 107,191 plan by -8%, primarily due to a 5pp gap in approval rates (65% actual vs 70% plan) despite traffic and submission volumes meeting targets.</w:t>
       </w:r>
     </w:p>
     <w:p>
@@ -1541,7 +1555,7 @@
         <w:t xml:space="preserve">MoM bridge (fact). </w:t>
       </w:r>
       <w:r>
-        <w:t>Growth decomposes into Eligible Base x1.05 and Approval Rate x1.00 (stable), but driven by Traffic/Eligible x1.31 (32% to 42%) and Submission/Traffic x1.00; 1.05 x 1.31 x 1.00 x 1.00 ~= 1.38, i.e. +38%.</w:t>
+        <w:t>Disbursement volume grew +38% MoM, decomposed as: Eligible Base (+5%) x Traffic Conversion (+10pp, driving +38% traffic volume) x Submission Rate (flat) x Approval Rate (flat) x Ticket Size (flat). Arithmetic: Base x1.05 and Traffic Lever x1.38 (driven by %Traffic/Eligible moving from 32% to 42%); 1.05 x 1.38 ~= 1.45, adjusted for funnel flow to yield the observed +38% volume increase.</w:t>
       </w:r>
     </w:p>
     <w:p>
@@ -1555,7 +1569,7 @@
         <w:t xml:space="preserve">Plan-miss bridge (fact). </w:t>
       </w:r>
       <w:r>
-        <w:t>The 8% miss vs plan (VNDm 107,191) is fully attributed to the Approval Rate gap of -5pp (actual 65% vs plan 70%), as Traffic, Eligible Base, and Ticket Size all met or exceeded targets.</w:t>
+        <w:t>The -8% miss vs plan (VNDm 8,595 gap) is driven entirely by the Approval Rate lever, which underperformed by -5pp (65% actual vs 70% plan). Traffic and Submission levers were on plan; the eligible base was on plan; ticket size was on plan. The shortfall is not attributed to a specific failed initiative but to the aggregate performance of the approval engine against the 70% target.</w:t>
       </w:r>
     </w:p>
     <w:p>
@@ -1576,7 +1590,7 @@
         <w:pStyle w:val="ListBullet"/>
       </w:pPr>
       <w:r>
-        <w:t>Eligible Base: Stable at 35% of total users; Initiative #1.0 (Persona 1) live since 7/6 delivered expected uplift, but Initiative #2.0 (Persona 1) delayed to Oct-26 due to missing API risk-based pricing scope.</w:t>
+        <w:t>Initiative #1.0 (Persona 1, Live): Added partner with higher risk appetite; status Live since May-26. Impact on %Eligible/Total User Base (+10pp) is not yet realized in June data (flat at 35%), suggesting the partner volume is still ramping or offset by other factors.</w:t>
       </w:r>
     </w:p>
     <w:p>
@@ -1584,7 +1598,23 @@
         <w:pStyle w:val="ListBullet"/>
       </w:pPr>
       <w:r>
-        <w:t>Approval Rate: Missed plan by 5pp; Initiative #3.0 (Persona 2) remains on track for Sep-26 but current model v1 Gini scores are below expectations, limiting immediate scoring improvements.</w:t>
+        <w:t>Initiative #2.0 (Persona 1, Delay): Second high-risk partner delayed to Oct-26 due to API risk-based pricing scope gaps; +10pp impact on eligible base deferred.</w:t>
+      </w:r>
+    </w:p>
+    <w:p>
+      <w:pPr>
+        <w:pStyle w:val="ListBullet"/>
+      </w:pPr>
+      <w:r>
+        <w:t>Initiative #3.0 (Persona 2, On Track): New scoring model for new segments targeting Sep-26; +15pp impact on eligible base not yet measurable; model optimization ongoing due to lower-than-expected Gini.</w:t>
+      </w:r>
+    </w:p>
+    <w:p>
+      <w:pPr>
+        <w:pStyle w:val="ListBullet"/>
+      </w:pPr>
+      <w:r>
+        <w:t>Initiative #4.0 (Persona 3, Live): New product launch live 7/6; targeted +10pp impact on %Traffic/Eligible. Realized impact: +10pp (32% to 42%), fully credited to this initiative.</w:t>
       </w:r>
     </w:p>
     <w:p>
@@ -1605,7 +1635,7 @@
         <w:pStyle w:val="ListBullet"/>
       </w:pPr>
       <w:r>
-        <w:t>Traffic/Eligible: Exceeded plan by 10pp (42% vs 35%); Initiative #4.0 (Persona 3) live since 7/6 successfully unlocked new demand, while Initiative #6.0 (Persona 3) contributed incremental channel traffic.</w:t>
+        <w:t>Initiative #6.0 (Persona 3, Live): New traffic channel #1 live Mar-26; targeted +2pp on %Traffic/Eligible. Realized impact: Partially embedded in the +10pp total traffic lift; specific contribution not isolated in data.</w:t>
       </w:r>
     </w:p>
     <w:p>
@@ -1613,7 +1643,47 @@
         <w:pStyle w:val="ListBullet"/>
       </w:pPr>
       <w:r>
-        <w:t>Submission/Traffic: Met plan at 14%; Initiatives #8.0 and #9.0 (Persona 1) live since Feb/Mar-26 maintained conversion stability despite traffic volume increases.</w:t>
+        <w:t>Initiative #7.0 (Persona 3, Deprioritized): New traffic channel #2 moved to Q4-26 due to Cashier team capacity and performance test instability; +2pp impact deferred.</w:t>
+      </w:r>
+    </w:p>
+    <w:p>
+      <w:pPr>
+        <w:pStyle w:val="ListBullet"/>
+      </w:pPr>
+      <w:r>
+        <w:t>Initiative #8.0 (Persona 1, Live): Landing Page layout revamp live Feb-26; targeted +2pp on %Submission/Traffic. Realized impact: Not measurable (rate flat at 14%); potential offset by other factors or insufficient lift.</w:t>
+      </w:r>
+    </w:p>
+    <w:p>
+      <w:pPr>
+        <w:pStyle w:val="ListBullet"/>
+      </w:pPr>
+      <w:r>
+        <w:t>Initiative #9.0 (Persona 1, Live): Diverse product offerings live Mar-26; targeted +2pp submission and +10% ticket size. Realized impact: Submission rate flat (14%); Ticket size flat (VNDm 110); impact not yet realized.</w:t>
+      </w:r>
+    </w:p>
+    <w:p>
+      <w:pPr>
+        <w:pStyle w:val="ListBullet"/>
+      </w:pPr>
+      <w:r>
+        <w:t>Initiative #10.0 (Persona 2, Delay): Personalized offerings delayed to post-Jul-26 due to DS team prioritization of model optimization; +2pp submission impact not available for July.</w:t>
+      </w:r>
+    </w:p>
+    <w:p>
+      <w:pPr>
+        <w:pStyle w:val="ListBullet"/>
+      </w:pPr>
+      <w:r>
+        <w:t>Initiative #11.0 (Persona 3, Deprioritized): Redirect tactics for dropped customers moved to Q4/26; +0.5pp impact deferred.</w:t>
+      </w:r>
+    </w:p>
+    <w:p>
+      <w:pPr>
+        <w:pStyle w:val="ListBullet"/>
+      </w:pPr>
+      <w:r>
+        <w:t>Initiative #12.0 (Persona 3, Not started): Year-end campaign planned for Q4; +5pp traffic impact not yet in scope.</w:t>
       </w:r>
     </w:p>
     <w:p>
@@ -1639,7 +1709,7 @@
         <w:t xml:space="preserve">Run-rate. </w:t>
       </w:r>
       <w:r>
-        <w:t>July disbursement run-rate is projected at VNDm 103,525 (+5% MoM), yet remains 23% below the July plan of VNDm 134,754 due to persistent approval rate constraints.</w:t>
+        <w:t>July disbursement run-rate is projected at VNDm 103,525 (+5% MoM vs June actual), which remains -23% vs the July plan of VNDm 134,754. This run-rate assumes current approval rates (65%) persist and excludes delayed initiatives.</w:t>
       </w:r>
     </w:p>
     <w:p>
@@ -1660,7 +1730,15 @@
         <w:pStyle w:val="ListBullet"/>
       </w:pPr>
       <w:r>
-        <w:t>Approval Rate: No immediate structural unlock expected in July; reliance on Initiative #3.0 (Persona 2) optimization remains critical for Sep-26 delivery.</w:t>
+        <w:t>No new structural initiatives land in July; #2.0 remains delayed to Oct-26 and #3.0 to Sep-26.</w:t>
+      </w:r>
+    </w:p>
+    <w:p>
+      <w:pPr>
+        <w:pStyle w:val="ListBullet"/>
+      </w:pPr>
+      <w:r>
+        <w:t>Approval rate gap (-5pp vs plan) remains the primary structural drag on July volume.</w:t>
       </w:r>
     </w:p>
     <w:p>
@@ -1681,7 +1759,15 @@
         <w:pStyle w:val="ListBullet"/>
       </w:pPr>
       <w:r>
-        <w:t>Traffic: Initiative #7.0 (Persona 3) deprioritized to Q4-26 due to Cashier team capacity constraints, limiting potential +2pp traffic uplift in July.</w:t>
+        <w:t>Initiative #10.0 (Personalization) is delayed and will not contribute to July submission rates.</w:t>
+      </w:r>
+    </w:p>
+    <w:p>
+      <w:pPr>
+        <w:pStyle w:val="ListBullet"/>
+      </w:pPr>
+      <w:r>
+        <w:t>Initiative #7.0 (Traffic channel #2) is deprioritized; no incremental traffic lift expected in July from this source.</w:t>
       </w:r>
     </w:p>
     <w:p>
@@ -1817,7 +1903,7 @@
               <w:rPr>
                 <w:sz w:val="17"/>
               </w:rPr>
-              <w:t>Initiative #3.0 (Persona 2)</w:t>
+              <w:t>Persona 2 (Model Optimization) / Risk Team</w:t>
             </w:r>
           </w:p>
         </w:tc>
@@ -1831,7 +1917,7 @@
               <w:rPr>
                 <w:sz w:val="17"/>
               </w:rPr>
-              <w:t>Close the 5pp gap to plan by optimizing model v1 Gini scores before Sep-26 launch to unlock disbursement volume.</w:t>
+              <w:t>Close the -5pp gap (65% vs 70% plan) to unlock the VNDm 8,595 monthly volume shortfall and align with FY targets.</w:t>
             </w:r>
           </w:p>
         </w:tc>
@@ -1875,7 +1961,7 @@
               <w:rPr>
                 <w:sz w:val="17"/>
               </w:rPr>
-              <w:t>Initiative #2.0 (Persona 1)</w:t>
+              <w:t>Persona 1 (Partner #2)</w:t>
             </w:r>
           </w:p>
         </w:tc>
@@ -1889,7 +1975,65 @@
               <w:rPr>
                 <w:sz w:val="17"/>
               </w:rPr>
-              <w:t>Resolve API risk-based pricing scope to avoid further delays beyond Oct-26, targeting +10pp eligible base uplift.</w:t>
+              <w:t>Resolve API risk-based pricing scope to accelerate #2.0 from Oct-26 to earlier, unlocking +10pp eligible base growth.</w:t>
+            </w:r>
+          </w:p>
+        </w:tc>
+      </w:tr>
+      <w:tr>
+        <w:tc>
+          <w:tcPr>
+            <w:tcW w:type="dxa" w:w="2160"/>
+          </w:tcPr>
+          <w:p>
+            <w:r/>
+            <w:r>
+              <w:rPr>
+                <w:sz w:val="17"/>
+              </w:rPr>
+              <w:t>3</w:t>
+            </w:r>
+          </w:p>
+        </w:tc>
+        <w:tc>
+          <w:tcPr>
+            <w:tcW w:type="dxa" w:w="2160"/>
+          </w:tcPr>
+          <w:p>
+            <w:r/>
+            <w:r>
+              <w:rPr>
+                <w:sz w:val="17"/>
+              </w:rPr>
+              <w:t>Incremental — Submission Rate Lift</w:t>
+            </w:r>
+          </w:p>
+        </w:tc>
+        <w:tc>
+          <w:tcPr>
+            <w:tcW w:type="dxa" w:w="2160"/>
+          </w:tcPr>
+          <w:p>
+            <w:r/>
+            <w:r>
+              <w:rPr>
+                <w:sz w:val="17"/>
+              </w:rPr>
+              <w:t>Persona 1 (Product Diversity)</w:t>
+            </w:r>
+          </w:p>
+        </w:tc>
+        <w:tc>
+          <w:tcPr>
+            <w:tcW w:type="dxa" w:w="2160"/>
+          </w:tcPr>
+          <w:p>
+            <w:r/>
+            <w:r>
+              <w:rPr>
+                <w:sz w:val="17"/>
+              </w:rPr>
+              <w:t>Diagnose why #9.0 (Diverse offerings) has not moved submission rates or ticket sizes despite being live since Mar-26.</w:t>
             </w:r>
           </w:p>
         </w:tc>
@@ -2027,7 +2171,7 @@
               <w:rPr>
                 <w:sz w:val="17"/>
               </w:rPr>
-              <w:t>Initiative #1.0 landed (+10pp); Initiative #2.0 delayed to Oct-26; Initiative #3.0 on track for Sep-26 (+15pp).</w:t>
+              <w:t>#1.0 Live (impact not yet visible); #2.0 Delayed to Oct-26; #3.0 On Track for Sep-26</w:t>
             </w:r>
           </w:p>
         </w:tc>
@@ -2085,7 +2229,7 @@
               <w:rPr>
                 <w:sz w:val="17"/>
               </w:rPr>
-              <w:t>Current model underperforming; new scoring model (Initiative #3.0) pending Sep-26.</w:t>
+              <w:t>Current rate 65% vs 70% plan; no specific initiative listed as 'Live' to fix this gap yet</w:t>
             </w:r>
           </w:p>
         </w:tc>
@@ -2099,7 +2243,7 @@
               <w:rPr>
                 <w:sz w:val="17"/>
               </w:rPr>
-              <w:t>Medium</w:t>
+              <w:t>Low</w:t>
             </w:r>
           </w:p>
         </w:tc>
@@ -2113,7 +2257,7 @@
               <w:rPr>
                 <w:sz w:val="17"/>
               </w:rPr>
-              <w:t>On track</w:t>
+              <w:t>Behind</w:t>
             </w:r>
           </w:p>
         </w:tc>
@@ -2239,7 +2383,7 @@
               <w:rPr>
                 <w:sz w:val="17"/>
               </w:rPr>
-              <w:t>Initiative #4.0 landed (+10pp); Initiative #7.0 deprioritized to Q4.</w:t>
+              <w:t>#4.0 Live (+10pp realized); #6.0 Live (partial); #7.0 Deprioritized to Q4</w:t>
             </w:r>
           </w:p>
         </w:tc>
@@ -2253,7 +2397,7 @@
               <w:rPr>
                 <w:sz w:val="17"/>
               </w:rPr>
-              <w:t>+10pp (landed)</w:t>
+              <w:t>+10pp realized, +4pp deferred</w:t>
             </w:r>
           </w:p>
         </w:tc>
@@ -2283,7 +2427,7 @@
               <w:rPr>
                 <w:sz w:val="17"/>
               </w:rPr>
-              <w:t>Conversion Optimization</w:t>
+              <w:t>Submission &amp; Ticket Size</w:t>
             </w:r>
           </w:p>
         </w:tc>
@@ -2297,7 +2441,7 @@
               <w:rPr>
                 <w:sz w:val="17"/>
               </w:rPr>
-              <w:t>Initiatives #8.0 and #9.0 live; Initiative #10.0 delayed.</w:t>
+              <w:t>#8.0, #9.0 Live (0pp/0% realized); #10.0 Delayed</w:t>
             </w:r>
           </w:p>
         </w:tc>
@@ -2311,7 +2455,7 @@
               <w:rPr>
                 <w:sz w:val="17"/>
               </w:rPr>
-              <w:t>+4pp (landed)</w:t>
+              <w:t>0pp/0% realized</w:t>
             </w:r>
           </w:p>
         </w:tc>
@@ -2325,7 +2469,7 @@
               <w:rPr>
                 <w:sz w:val="17"/>
               </w:rPr>
-              <w:t>On track</w:t>
+              <w:t>Behind</w:t>
             </w:r>
           </w:p>
         </w:tc>
@@ -2352,9 +2496,485 @@
         <w:rPr>
           <w:b w:val="0"/>
         </w:rPr>
-        <w:t>YTD disbursement stands at VNDm 277,174, missing the plan of VNDm 339,865 by 18%. To hit the FY plan of VNDm 1,879,405, the business must recover the approval rate gap via Initiative #3.0 in Q3 and accelerate Initiative #2.0 to Q4, assuming traffic growth remains stable.</w:t>
+        <w:t>YTD disbursement stands at VNDm 277,174 vs plan VNDm 339,865 (-18% gap). To hit the FY plan of VNDm 1,879,405, the business must recover the -5pp approval rate gap immediately and accelerate the delayed structural initiatives (#2.0, #3.0). Without these, the current run-rate of VNDm 103,525/month implies a significant FY shortfall.</w:t>
       </w:r>
     </w:p>
+    <w:p>
+      <w:pPr>
+        <w:spacing w:after="60"/>
+      </w:pPr>
+      <w:r>
+        <w:rPr>
+          <w:b/>
+          <w:color w:val="1F4E79"/>
+          <w:sz w:val="22"/>
+        </w:rPr>
+        <w:t>Escalations — high-impact initiatives delayed / deprioritized</w:t>
+      </w:r>
+    </w:p>
+    <w:tbl>
+      <w:tblPr>
+        <w:tblStyle w:val="TableGrid"/>
+        <w:tblW w:type="auto" w:w="0"/>
+        <w:tblLook w:firstColumn="1" w:firstRow="1" w:lastColumn="0" w:lastRow="0" w:noHBand="0" w:noVBand="1" w:val="04A0"/>
+      </w:tblPr>
+      <w:tblGrid>
+        <w:gridCol w:w="1440"/>
+        <w:gridCol w:w="1440"/>
+        <w:gridCol w:w="1440"/>
+        <w:gridCol w:w="1440"/>
+        <w:gridCol w:w="1440"/>
+        <w:gridCol w:w="1440"/>
+      </w:tblGrid>
+      <w:tr>
+        <w:tc>
+          <w:tcPr>
+            <w:tcW w:type="dxa" w:w="1440"/>
+            <w:shd w:val="clear" w:fill="1F4E79"/>
+          </w:tcPr>
+          <w:p>
+            <w:r/>
+            <w:r>
+              <w:rPr>
+                <w:b/>
+                <w:color w:val="FFFFFF"/>
+                <w:sz w:val="17"/>
+              </w:rPr>
+              <w:t>Initiative</w:t>
+            </w:r>
+          </w:p>
+        </w:tc>
+        <w:tc>
+          <w:tcPr>
+            <w:tcW w:type="dxa" w:w="1440"/>
+            <w:shd w:val="clear" w:fill="1F4E79"/>
+          </w:tcPr>
+          <w:p>
+            <w:r/>
+            <w:r>
+              <w:rPr>
+                <w:b/>
+                <w:color w:val="FFFFFF"/>
+                <w:sz w:val="17"/>
+              </w:rPr>
+              <w:t>Owner</w:t>
+            </w:r>
+          </w:p>
+        </w:tc>
+        <w:tc>
+          <w:tcPr>
+            <w:tcW w:type="dxa" w:w="1440"/>
+            <w:shd w:val="clear" w:fill="1F4E79"/>
+          </w:tcPr>
+          <w:p>
+            <w:r/>
+            <w:r>
+              <w:rPr>
+                <w:b/>
+                <w:color w:val="FFFFFF"/>
+                <w:sz w:val="17"/>
+              </w:rPr>
+              <w:t>Status</w:t>
+            </w:r>
+          </w:p>
+        </w:tc>
+        <w:tc>
+          <w:tcPr>
+            <w:tcW w:type="dxa" w:w="1440"/>
+            <w:shd w:val="clear" w:fill="1F4E79"/>
+          </w:tcPr>
+          <w:p>
+            <w:r/>
+            <w:r>
+              <w:rPr>
+                <w:b/>
+                <w:color w:val="FFFFFF"/>
+                <w:sz w:val="17"/>
+              </w:rPr>
+              <w:t>Impact</w:t>
+            </w:r>
+          </w:p>
+        </w:tc>
+        <w:tc>
+          <w:tcPr>
+            <w:tcW w:type="dxa" w:w="1440"/>
+            <w:shd w:val="clear" w:fill="1F4E79"/>
+          </w:tcPr>
+          <w:p>
+            <w:r/>
+            <w:r>
+              <w:rPr>
+                <w:b/>
+                <w:color w:val="FFFFFF"/>
+                <w:sz w:val="17"/>
+              </w:rPr>
+              <w:t>New timing</w:t>
+            </w:r>
+          </w:p>
+        </w:tc>
+        <w:tc>
+          <w:tcPr>
+            <w:tcW w:type="dxa" w:w="1440"/>
+            <w:shd w:val="clear" w:fill="1F4E79"/>
+          </w:tcPr>
+          <w:p>
+            <w:r/>
+            <w:r>
+              <w:rPr>
+                <w:b/>
+                <w:color w:val="FFFFFF"/>
+                <w:sz w:val="17"/>
+              </w:rPr>
+              <w:t>Note</w:t>
+            </w:r>
+          </w:p>
+        </w:tc>
+      </w:tr>
+      <w:tr>
+        <w:tc>
+          <w:tcPr>
+            <w:tcW w:type="dxa" w:w="1440"/>
+          </w:tcPr>
+          <w:p>
+            <w:r/>
+            <w:r>
+              <w:rPr>
+                <w:sz w:val="17"/>
+              </w:rPr>
+              <w:t>Add 1 partner with higher risk appetite</w:t>
+            </w:r>
+          </w:p>
+        </w:tc>
+        <w:tc>
+          <w:tcPr>
+            <w:tcW w:type="dxa" w:w="1440"/>
+          </w:tcPr>
+          <w:p>
+            <w:r/>
+            <w:r>
+              <w:rPr>
+                <w:sz w:val="17"/>
+              </w:rPr>
+              <w:t>Persona 1</w:t>
+            </w:r>
+          </w:p>
+        </w:tc>
+        <w:tc>
+          <w:tcPr>
+            <w:tcW w:type="dxa" w:w="1440"/>
+          </w:tcPr>
+          <w:p>
+            <w:r/>
+            <w:r>
+              <w:rPr>
+                <w:sz w:val="17"/>
+              </w:rPr>
+              <w:t>Delay</w:t>
+            </w:r>
+          </w:p>
+        </w:tc>
+        <w:tc>
+          <w:tcPr>
+            <w:tcW w:type="dxa" w:w="1440"/>
+          </w:tcPr>
+          <w:p>
+            <w:r/>
+            <w:r>
+              <w:rPr>
+                <w:sz w:val="17"/>
+              </w:rPr>
+              <w:t>%Eligible/Total User Base +10pp</w:t>
+            </w:r>
+          </w:p>
+        </w:tc>
+        <w:tc>
+          <w:tcPr>
+            <w:tcW w:type="dxa" w:w="1440"/>
+          </w:tcPr>
+          <w:p>
+            <w:r/>
+            <w:r>
+              <w:rPr>
+                <w:sz w:val="17"/>
+              </w:rPr>
+              <w:t>Oct-26</w:t>
+            </w:r>
+          </w:p>
+        </w:tc>
+        <w:tc>
+          <w:tcPr>
+            <w:tcW w:type="dxa" w:w="1440"/>
+          </w:tcPr>
+          <w:p>
+            <w:r/>
+            <w:r>
+              <w:rPr>
+                <w:sz w:val="17"/>
+              </w:rPr>
+              <w:t>Đối tác yêu cầu bắt buộc API risk-based pricing chưa nằm trong scope, dự kiến delay sang tháng 10.</w:t>
+            </w:r>
+          </w:p>
+        </w:tc>
+      </w:tr>
+      <w:tr>
+        <w:tc>
+          <w:tcPr>
+            <w:tcW w:type="dxa" w:w="1440"/>
+          </w:tcPr>
+          <w:p>
+            <w:r/>
+            <w:r>
+              <w:rPr>
+                <w:sz w:val="17"/>
+              </w:rPr>
+              <w:t>Discover new traffic channel #2</w:t>
+            </w:r>
+          </w:p>
+        </w:tc>
+        <w:tc>
+          <w:tcPr>
+            <w:tcW w:type="dxa" w:w="1440"/>
+          </w:tcPr>
+          <w:p>
+            <w:r/>
+            <w:r>
+              <w:rPr>
+                <w:sz w:val="17"/>
+              </w:rPr>
+              <w:t>Persona 3</w:t>
+            </w:r>
+          </w:p>
+        </w:tc>
+        <w:tc>
+          <w:tcPr>
+            <w:tcW w:type="dxa" w:w="1440"/>
+          </w:tcPr>
+          <w:p>
+            <w:r/>
+            <w:r>
+              <w:rPr>
+                <w:sz w:val="17"/>
+              </w:rPr>
+              <w:t>Deprioritized</w:t>
+            </w:r>
+          </w:p>
+        </w:tc>
+        <w:tc>
+          <w:tcPr>
+            <w:tcW w:type="dxa" w:w="1440"/>
+          </w:tcPr>
+          <w:p>
+            <w:r/>
+            <w:r>
+              <w:rPr>
+                <w:sz w:val="17"/>
+              </w:rPr>
+              <w:t>%Traffic/Eligible +2pp</w:t>
+            </w:r>
+          </w:p>
+        </w:tc>
+        <w:tc>
+          <w:tcPr>
+            <w:tcW w:type="dxa" w:w="1440"/>
+          </w:tcPr>
+          <w:p>
+            <w:r/>
+            <w:r>
+              <w:rPr>
+                <w:sz w:val="17"/>
+              </w:rPr>
+              <w:t>Q4-2026</w:t>
+            </w:r>
+          </w:p>
+        </w:tc>
+        <w:tc>
+          <w:tcPr>
+            <w:tcW w:type="dxa" w:w="1440"/>
+          </w:tcPr>
+          <w:p>
+            <w:r/>
+            <w:r>
+              <w:rPr>
+                <w:sz w:val="17"/>
+              </w:rPr>
+              <w:t>Do team Cashier full load và performance test chưa ổn định, đã đồng ý deprioritize và reschedule sang Q4.</w:t>
+            </w:r>
+          </w:p>
+        </w:tc>
+      </w:tr>
+      <w:tr>
+        <w:tc>
+          <w:tcPr>
+            <w:tcW w:type="dxa" w:w="1440"/>
+          </w:tcPr>
+          <w:p>
+            <w:r/>
+            <w:r>
+              <w:rPr>
+                <w:sz w:val="17"/>
+              </w:rPr>
+              <w:t>Personalize offerings per users using big data</w:t>
+            </w:r>
+          </w:p>
+        </w:tc>
+        <w:tc>
+          <w:tcPr>
+            <w:tcW w:type="dxa" w:w="1440"/>
+          </w:tcPr>
+          <w:p>
+            <w:r/>
+            <w:r>
+              <w:rPr>
+                <w:sz w:val="17"/>
+              </w:rPr>
+              <w:t>Persona 2</w:t>
+            </w:r>
+          </w:p>
+        </w:tc>
+        <w:tc>
+          <w:tcPr>
+            <w:tcW w:type="dxa" w:w="1440"/>
+          </w:tcPr>
+          <w:p>
+            <w:r/>
+            <w:r>
+              <w:rPr>
+                <w:sz w:val="17"/>
+              </w:rPr>
+              <w:t>Delay</w:t>
+            </w:r>
+          </w:p>
+        </w:tc>
+        <w:tc>
+          <w:tcPr>
+            <w:tcW w:type="dxa" w:w="1440"/>
+          </w:tcPr>
+          <w:p>
+            <w:r/>
+            <w:r>
+              <w:rPr>
+                <w:sz w:val="17"/>
+              </w:rPr>
+              <w:t>%Submission/Traffic +2pp</w:t>
+            </w:r>
+          </w:p>
+        </w:tc>
+        <w:tc>
+          <w:tcPr>
+            <w:tcW w:type="dxa" w:w="1440"/>
+          </w:tcPr>
+          <w:p>
+            <w:r/>
+            <w:r>
+              <w:rPr>
+                <w:sz w:val="17"/>
+              </w:rPr>
+              <w:t>nan</w:t>
+            </w:r>
+          </w:p>
+        </w:tc>
+        <w:tc>
+          <w:tcPr>
+            <w:tcW w:type="dxa" w:w="1440"/>
+          </w:tcPr>
+          <w:p>
+            <w:r/>
+            <w:r>
+              <w:rPr>
+                <w:sz w:val="17"/>
+              </w:rPr>
+              <w:t>Không thể bắt đầu scoping do team DS đang ưu tiên init optimize model, timeline tháng 7 không khả thi.</w:t>
+            </w:r>
+          </w:p>
+        </w:tc>
+      </w:tr>
+      <w:tr>
+        <w:tc>
+          <w:tcPr>
+            <w:tcW w:type="dxa" w:w="1440"/>
+          </w:tcPr>
+          <w:p>
+            <w:r/>
+            <w:r>
+              <w:rPr>
+                <w:sz w:val="17"/>
+              </w:rPr>
+              <w:t>New redirecting tactics for dropped customers</w:t>
+            </w:r>
+          </w:p>
+        </w:tc>
+        <w:tc>
+          <w:tcPr>
+            <w:tcW w:type="dxa" w:w="1440"/>
+          </w:tcPr>
+          <w:p>
+            <w:r/>
+            <w:r>
+              <w:rPr>
+                <w:sz w:val="17"/>
+              </w:rPr>
+              <w:t>Persona 3</w:t>
+            </w:r>
+          </w:p>
+        </w:tc>
+        <w:tc>
+          <w:tcPr>
+            <w:tcW w:type="dxa" w:w="1440"/>
+          </w:tcPr>
+          <w:p>
+            <w:r/>
+            <w:r>
+              <w:rPr>
+                <w:sz w:val="17"/>
+              </w:rPr>
+              <w:t>Deprioritized</w:t>
+            </w:r>
+          </w:p>
+        </w:tc>
+        <w:tc>
+          <w:tcPr>
+            <w:tcW w:type="dxa" w:w="1440"/>
+          </w:tcPr>
+          <w:p>
+            <w:r/>
+            <w:r>
+              <w:rPr>
+                <w:sz w:val="17"/>
+              </w:rPr>
+              <w:t>%Submission/Traffic +0.5pp</w:t>
+            </w:r>
+          </w:p>
+        </w:tc>
+        <w:tc>
+          <w:tcPr>
+            <w:tcW w:type="dxa" w:w="1440"/>
+          </w:tcPr>
+          <w:p>
+            <w:r/>
+            <w:r>
+              <w:rPr>
+                <w:sz w:val="17"/>
+              </w:rPr>
+              <w:t>Q4/2026</w:t>
+            </w:r>
+          </w:p>
+        </w:tc>
+        <w:tc>
+          <w:tcPr>
+            <w:tcW w:type="dxa" w:w="1440"/>
+          </w:tcPr>
+          <w:p>
+            <w:r/>
+            <w:r>
+              <w:rPr>
+                <w:sz w:val="17"/>
+              </w:rPr>
+              <w:t>Low expected impact (+0.5pp); deprioritized vs higher-impact channel work; may revisit Q4.</w:t>
+            </w:r>
+          </w:p>
+        </w:tc>
+      </w:tr>
+    </w:tbl>
     <w:p>
       <w:pPr>
         <w:spacing w:after="60"/>
@@ -2373,7 +2993,7 @@
         <w:pStyle w:val="ListBullet"/>
       </w:pPr>
       <w:r>
-        <w:t>Initiative #2.0 (Persona 1): High risk of further delay beyond Oct-26 if API risk-based pricing scope is not resolved, threatening eligible base targets.</w:t>
+        <w:t>Initiative #2.0 (Persona 1): API risk-based pricing scope gap may extend delay beyond Oct-26, permanently reducing FY eligible base potential.</w:t>
       </w:r>
     </w:p>
     <w:p>
@@ -2381,7 +3001,7 @@
         <w:pStyle w:val="ListBullet"/>
       </w:pPr>
       <w:r>
-        <w:t>Initiative #3.0 (Persona 2): Medium risk that model v1 optimization fails to meet Gini expectations, delaying the Sep-26 launch and approval rate recovery.</w:t>
+        <w:t>Initiative #3.0 (Persona 2): Low Gini on Model v1 may require further optimization, risking the Sep-26 launch timeline for new segments.</w:t>
       </w:r>
     </w:p>
     <w:p>
@@ -2389,7 +3009,15 @@
         <w:pStyle w:val="ListBullet"/>
       </w:pPr>
       <w:r>
-        <w:t>Initiative #10.0 (Persona 2): Low confidence in July start due to DS team prioritization conflicts, risking submission rate stagnation.</w:t>
+        <w:t>Initiative #10.0 (Persona 2): DS team prioritization of model optimization over personalization scoping creates a dependency risk for July submission targets.</w:t>
+      </w:r>
+    </w:p>
+    <w:p>
+      <w:pPr>
+        <w:pStyle w:val="ListBullet"/>
+      </w:pPr>
+      <w:r>
+        <w:t>Approval Rate Gap: No specific initiative is currently flagged as 'Live' to address the -5pp approval rate miss; risk of persistent underperformance vs plan.</w:t>
       </w:r>
     </w:p>
     <w:sectPr>

</xml_diff>

<commit_message>
Refresh Report_Sample with corrected June run (Excel closed)
Canonical tracker now reflects accurate extraction: #3 New modelling reads the
latest "Gini up to 0.3, near threshold"; #10 personalization new timing = Aug-26.
Forecast / Performance analysis / report .docx regenerated consistently.

Co-Authored-By: Claude Opus 4.8 (1M context) <noreply@anthropic.com>
</commit_message>
<xml_diff>
--- a/Report_Sample/Report/Report thang 6 nam 2026.docx
+++ b/Report_Sample/Report/Report thang 6 nam 2026.docx
@@ -1501,7 +1501,7 @@
         <w:t xml:space="preserve">Read: </w:t>
       </w:r>
       <w:r>
-        <w:t>June 2026 disbursement volume reached VNDm 98,596, a +38% MoM increase driven by a 38% rise in traffic and approvals, though the month closed -8% vs plan due to a 5pp shortfall in approval rates. The eligible base grew mechanically by 5% in line with total user base expansion, while traffic conversion to eligible users improved by 10pp.</w:t>
+        <w:t>Disbursement volume reached VNDm 98,596 in June, up 38% MoM but missing the VNDm 107,191 plan by 8%. The funnel shows a 38% MoM increase in traffic and approvals driven by a 10pp lift in traffic-to-eligible conversion, while approval rates and ticket sizes remained flat.</w:t>
       </w:r>
     </w:p>
     <w:p>
@@ -1541,7 +1541,7 @@
         <w:t xml:space="preserve">Headline. </w:t>
       </w:r>
       <w:r>
-        <w:t>June disbursement volume hit VNDm 98,596 (+38% MoM) but missed the VNDm 107,191 plan by -8%, primarily due to a 5pp gap in approval rates (65% actual vs 70% plan) despite traffic and submission volumes meeting targets.</w:t>
+        <w:t>June disbursement hit VNDm 98,596 (+38% MoM) but missed plan by 8% (VNDm 107,191) due to a 5pp shortfall in approval rates despite a successful 10pp lift in traffic conversion.</w:t>
       </w:r>
     </w:p>
     <w:p>
@@ -1555,7 +1555,7 @@
         <w:t xml:space="preserve">MoM bridge (fact). </w:t>
       </w:r>
       <w:r>
-        <w:t>Disbursement volume grew +38% MoM, decomposed as: Eligible Base (+5%) x Traffic Conversion (+10pp, driving +38% traffic volume) x Submission Rate (flat) x Approval Rate (flat) x Ticket Size (flat). Arithmetic: Base x1.05 and Traffic Lever x1.38 (driven by %Traffic/Eligible moving from 32% to 42%); 1.05 x 1.38 ~= 1.45, adjusted for funnel flow to yield the observed +38% volume increase.</w:t>
+        <w:t>Disbursement growth of +38% decomposes into Eligible Base x1.05 (mechanical, +5% user base) and Traffic Conversion x1.31 (real, +10pp lift in %Traffic/Eligible); 1.05 x 1.31 ~= 1.38, i.e. +38%. Submission and Approval volumes grew mechanically (+38%) as conversion rates (%Submission/Traffic and %Approval Rate) remained flat at 14% and 65% respectively.</w:t>
       </w:r>
     </w:p>
     <w:p>
@@ -1569,7 +1569,7 @@
         <w:t xml:space="preserve">Plan-miss bridge (fact). </w:t>
       </w:r>
       <w:r>
-        <w:t>The -8% miss vs plan (VNDm 8,595 gap) is driven entirely by the Approval Rate lever, which underperformed by -5pp (65% actual vs 70% plan). Traffic and Submission levers were on plan; the eligible base was on plan; ticket size was on plan. The shortfall is not attributed to a specific failed initiative but to the aggregate performance of the approval engine against the 70% target.</w:t>
+        <w:t>The 8% miss (VNDm 8,595) is entirely driven by the Approval Rate gap: actual 65% vs plan 70% (-5pp). While Traffic to Landing Page met plan (10k vs 10k) and Eligible Base was on plan (23k vs 24k), the failure to lift approval rates offset the traffic gains.</w:t>
       </w:r>
     </w:p>
     <w:p>
@@ -1590,7 +1590,7 @@
         <w:pStyle w:val="ListBullet"/>
       </w:pPr>
       <w:r>
-        <w:t>Initiative #1.0 (Persona 1, Live): Added partner with higher risk appetite; status Live since May-26. Impact on %Eligible/Total User Base (+10pp) is not yet realized in June data (flat at 35%), suggesting the partner volume is still ramping or offset by other factors.</w:t>
+        <w:t>Initiative #1.0 (Persona 1, On Track): Partner integration completed in May; however, the promised +10pp impact on %Eligible/Total User Base was not realized in June (remained flat at 35%), indicating the partner volume has not yet scaled or the risk appetite threshold was not fully utilized.</w:t>
       </w:r>
     </w:p>
     <w:p>
@@ -1598,7 +1598,7 @@
         <w:pStyle w:val="ListBullet"/>
       </w:pPr>
       <w:r>
-        <w:t>Initiative #2.0 (Persona 1, Delay): Second high-risk partner delayed to Oct-26 due to API risk-based pricing scope gaps; +10pp impact on eligible base deferred.</w:t>
+        <w:t>Initiative #2.0 (Persona 1, Delay): Second high-risk partner delayed to Oct-26 due to mandatory risk-based pricing API requirements; +10pp impact on %Eligible/Total User Base is not yet measurable.</w:t>
       </w:r>
     </w:p>
     <w:p>
@@ -1606,7 +1606,7 @@
         <w:pStyle w:val="ListBullet"/>
       </w:pPr>
       <w:r>
-        <w:t>Initiative #3.0 (Persona 2, On Track): New scoring model for new segments targeting Sep-26; +15pp impact on eligible base not yet measurable; model optimization ongoing due to lower-than-expected Gini.</w:t>
+        <w:t>Initiative #3.0 (Persona 2, On Track): New scoring model targeting +15pp on %Eligible/Total User Base remains on track for Sep-26 launch; no impact in June.</w:t>
       </w:r>
     </w:p>
     <w:p>
@@ -1614,7 +1614,7 @@
         <w:pStyle w:val="ListBullet"/>
       </w:pPr>
       <w:r>
-        <w:t>Initiative #4.0 (Persona 3, Live): New product launch live 7/6; targeted +10pp impact on %Traffic/Eligible. Realized impact: +10pp (32% to 42%), fully credited to this initiative.</w:t>
+        <w:t>Initiative #4.0 (Persona 3, Live): New product launched 7-Jun to unlock demand; successfully drove the +10pp lift in %Traffic/Eligible (32% to 42%), fully realizing the expected impact.</w:t>
       </w:r>
     </w:p>
     <w:p>
@@ -1635,7 +1635,7 @@
         <w:pStyle w:val="ListBullet"/>
       </w:pPr>
       <w:r>
-        <w:t>Initiative #6.0 (Persona 3, Live): New traffic channel #1 live Mar-26; targeted +2pp on %Traffic/Eligible. Realized impact: Partially embedded in the +10pp total traffic lift; specific contribution not isolated in data.</w:t>
+        <w:t>Initiative #6.0 (Persona 3, Live): New traffic channel #1 live since Mar-26; contribution to the +10pp traffic lift is not yet isolated from Initiative #4.0.</w:t>
       </w:r>
     </w:p>
     <w:p>
@@ -1643,7 +1643,7 @@
         <w:pStyle w:val="ListBullet"/>
       </w:pPr>
       <w:r>
-        <w:t>Initiative #7.0 (Persona 3, Deprioritized): New traffic channel #2 moved to Q4-26 due to Cashier team capacity and performance test instability; +2pp impact deferred.</w:t>
+        <w:t>Initiative #7.0 (Persona 3, Deprioritized): Traffic channel #2 deprioritized due to Cashier team load; +2pp impact deferred to Q4.</w:t>
       </w:r>
     </w:p>
     <w:p>
@@ -1651,7 +1651,7 @@
         <w:pStyle w:val="ListBullet"/>
       </w:pPr>
       <w:r>
-        <w:t>Initiative #8.0 (Persona 1, Live): Landing Page layout revamp live Feb-26; targeted +2pp on %Submission/Traffic. Realized impact: Not measurable (rate flat at 14%); potential offset by other factors or insufficient lift.</w:t>
+        <w:t>Initiative #8.0 (Persona 1, Live): Landing page revamp live since Feb-26; %Submission/Traffic remained flat at 14%, suggesting the +2pp target is not yet realized or offset by other factors.</w:t>
       </w:r>
     </w:p>
     <w:p>
@@ -1659,7 +1659,7 @@
         <w:pStyle w:val="ListBullet"/>
       </w:pPr>
       <w:r>
-        <w:t>Initiative #9.0 (Persona 1, Live): Diverse product offerings live Mar-26; targeted +2pp submission and +10% ticket size. Realized impact: Submission rate flat (14%); Ticket size flat (VNDm 110); impact not yet realized.</w:t>
+        <w:t>Initiative #9.0 (Persona 1, Live): Diverse offerings live since Mar-26; Average Ticket Size remained flat at VNDm 110, indicating the +10% target is not yet realized.</w:t>
       </w:r>
     </w:p>
     <w:p>
@@ -1667,7 +1667,7 @@
         <w:pStyle w:val="ListBullet"/>
       </w:pPr>
       <w:r>
-        <w:t>Initiative #10.0 (Persona 2, Delay): Personalized offerings delayed to post-Jul-26 due to DS team prioritization of model optimization; +2pp submission impact not available for July.</w:t>
+        <w:t>Initiative #10.0 (Persona 2, Delay): Personalization delayed to Aug-26 due to DS team prioritization; +2pp impact on %Submission/Traffic not yet measurable.</w:t>
       </w:r>
     </w:p>
     <w:p>
@@ -1675,7 +1675,7 @@
         <w:pStyle w:val="ListBullet"/>
       </w:pPr>
       <w:r>
-        <w:t>Initiative #11.0 (Persona 3, Deprioritized): Redirect tactics for dropped customers moved to Q4/26; +0.5pp impact deferred.</w:t>
+        <w:t>Initiative #11.0 (Persona 3, Deprioritized): Redirect tactics for dropped customers deprioritized; +0.5pp impact deferred to Q4.</w:t>
       </w:r>
     </w:p>
     <w:p>
@@ -1683,7 +1683,7 @@
         <w:pStyle w:val="ListBullet"/>
       </w:pPr>
       <w:r>
-        <w:t>Initiative #12.0 (Persona 3, Not started): Year-end campaign planned for Q4; +5pp traffic impact not yet in scope.</w:t>
+        <w:t>Initiative #12.0 (Persona 3, Not started): Year-end campaign planning for Q3; no impact in June.</w:t>
       </w:r>
     </w:p>
     <w:p>
@@ -1709,7 +1709,7 @@
         <w:t xml:space="preserve">Run-rate. </w:t>
       </w:r>
       <w:r>
-        <w:t>July disbursement run-rate is projected at VNDm 103,525 (+5% MoM vs June actual), which remains -23% vs the July plan of VNDm 134,754. This run-rate assumes current approval rates (65%) persist and excludes delayed initiatives.</w:t>
+        <w:t>July disbursement run-rate is VNDm 103,525 (+5% MoM vs June actual), which remains 23% below the July plan of VNDm 134,754.</w:t>
       </w:r>
     </w:p>
     <w:p>
@@ -1730,7 +1730,7 @@
         <w:pStyle w:val="ListBullet"/>
       </w:pPr>
       <w:r>
-        <w:t>No new structural initiatives land in July; #2.0 remains delayed to Oct-26 and #3.0 to Sep-26.</w:t>
+        <w:t>Initiative #2.0 (Persona 1) remains delayed until Oct-26; no structural base expansion expected in July.</w:t>
       </w:r>
     </w:p>
     <w:p>
@@ -1738,7 +1738,7 @@
         <w:pStyle w:val="ListBullet"/>
       </w:pPr>
       <w:r>
-        <w:t>Approval rate gap (-5pp vs plan) remains the primary structural drag on July volume.</w:t>
+        <w:t>Initiative #3.0 (Persona 2) launch scheduled for Sep-26; no approval rate improvement expected in July.</w:t>
       </w:r>
     </w:p>
     <w:p>
@@ -1759,7 +1759,7 @@
         <w:pStyle w:val="ListBullet"/>
       </w:pPr>
       <w:r>
-        <w:t>Initiative #10.0 (Personalization) is delayed and will not contribute to July submission rates.</w:t>
+        <w:t>Initiative #10.0 (Persona 2) delayed to Aug-26; no submission rate lift expected in July.</w:t>
       </w:r>
     </w:p>
     <w:p>
@@ -1767,7 +1767,7 @@
         <w:pStyle w:val="ListBullet"/>
       </w:pPr>
       <w:r>
-        <w:t>Initiative #7.0 (Traffic channel #2) is deprioritized; no incremental traffic lift expected in July from this source.</w:t>
+        <w:t>Initiative #7.0 and #11.0 remain deprioritized; no incremental traffic or submission gains expected in July.</w:t>
       </w:r>
     </w:p>
     <w:p>
@@ -1889,7 +1889,7 @@
               <w:rPr>
                 <w:sz w:val="17"/>
               </w:rPr>
-              <w:t>Structural — Approval Rate Optimization</w:t>
+              <w:t>Structural — Approval Rate</w:t>
             </w:r>
           </w:p>
         </w:tc>
@@ -1903,7 +1903,7 @@
               <w:rPr>
                 <w:sz w:val="17"/>
               </w:rPr>
-              <w:t>Persona 2 (Model Optimization) / Risk Team</w:t>
+              <w:t>Initiative #2.0 (Persona 1) &amp; #3.0 (Persona 2)</w:t>
             </w:r>
           </w:p>
         </w:tc>
@@ -1917,7 +1917,7 @@
               <w:rPr>
                 <w:sz w:val="17"/>
               </w:rPr>
-              <w:t>Close the -5pp gap (65% vs 70% plan) to unlock the VNDm 8,595 monthly volume shortfall and align with FY targets.</w:t>
+              <w:t>Close the 5pp gap vs plan (65% actual vs 70% target) to unlock disbursement volume; critical as traffic levers are already maximized.</w:t>
             </w:r>
           </w:p>
         </w:tc>
@@ -1947,7 +1947,7 @@
               <w:rPr>
                 <w:sz w:val="17"/>
               </w:rPr>
-              <w:t>Structural — Eligible Base Expansion</w:t>
+              <w:t>Incremental — Ticket Size</w:t>
             </w:r>
           </w:p>
         </w:tc>
@@ -1961,7 +1961,7 @@
               <w:rPr>
                 <w:sz w:val="17"/>
               </w:rPr>
-              <w:t>Persona 1 (Partner #2)</w:t>
+              <w:t>Initiative #9.0 (Persona 1)</w:t>
             </w:r>
           </w:p>
         </w:tc>
@@ -1975,65 +1975,7 @@
               <w:rPr>
                 <w:sz w:val="17"/>
               </w:rPr>
-              <w:t>Resolve API risk-based pricing scope to accelerate #2.0 from Oct-26 to earlier, unlocking +10pp eligible base growth.</w:t>
-            </w:r>
-          </w:p>
-        </w:tc>
-      </w:tr>
-      <w:tr>
-        <w:tc>
-          <w:tcPr>
-            <w:tcW w:type="dxa" w:w="2160"/>
-          </w:tcPr>
-          <w:p>
-            <w:r/>
-            <w:r>
-              <w:rPr>
-                <w:sz w:val="17"/>
-              </w:rPr>
-              <w:t>3</w:t>
-            </w:r>
-          </w:p>
-        </w:tc>
-        <w:tc>
-          <w:tcPr>
-            <w:tcW w:type="dxa" w:w="2160"/>
-          </w:tcPr>
-          <w:p>
-            <w:r/>
-            <w:r>
-              <w:rPr>
-                <w:sz w:val="17"/>
-              </w:rPr>
-              <w:t>Incremental — Submission Rate Lift</w:t>
-            </w:r>
-          </w:p>
-        </w:tc>
-        <w:tc>
-          <w:tcPr>
-            <w:tcW w:type="dxa" w:w="2160"/>
-          </w:tcPr>
-          <w:p>
-            <w:r/>
-            <w:r>
-              <w:rPr>
-                <w:sz w:val="17"/>
-              </w:rPr>
-              <w:t>Persona 1 (Product Diversity)</w:t>
-            </w:r>
-          </w:p>
-        </w:tc>
-        <w:tc>
-          <w:tcPr>
-            <w:tcW w:type="dxa" w:w="2160"/>
-          </w:tcPr>
-          <w:p>
-            <w:r/>
-            <w:r>
-              <w:rPr>
-                <w:sz w:val="17"/>
-              </w:rPr>
-              <w:t>Diagnose why #9.0 (Diverse offerings) has not moved submission rates or ticket sizes despite being live since Mar-26.</w:t>
+              <w:t>Realize the +10% ticket size target to drive volume without increasing approval risk; currently flat at VNDm 110.</w:t>
             </w:r>
           </w:p>
         </w:tc>
@@ -2171,7 +2113,7 @@
               <w:rPr>
                 <w:sz w:val="17"/>
               </w:rPr>
-              <w:t>#1.0 Live (impact not yet visible); #2.0 Delayed to Oct-26; #3.0 On Track for Sep-26</w:t>
+              <w:t>Initiative #1.0 live but impact not yet visible; #2.0 delayed to Oct-26; #3.0 on track for Sep-26.</w:t>
             </w:r>
           </w:p>
         </w:tc>
@@ -2229,7 +2171,7 @@
               <w:rPr>
                 <w:sz w:val="17"/>
               </w:rPr>
-              <w:t>Current rate 65% vs 70% plan; no specific initiative listed as 'Live' to fix this gap yet</w:t>
+              <w:t>No new models live in June; #3.0 pending Sep-26.</w:t>
             </w:r>
           </w:p>
         </w:tc>
@@ -2243,7 +2185,7 @@
               <w:rPr>
                 <w:sz w:val="17"/>
               </w:rPr>
-              <w:t>Low</w:t>
+              <w:t>High</w:t>
             </w:r>
           </w:p>
         </w:tc>
@@ -2257,7 +2199,7 @@
               <w:rPr>
                 <w:sz w:val="17"/>
               </w:rPr>
-              <w:t>Behind</w:t>
+              <w:t>On track</w:t>
             </w:r>
           </w:p>
         </w:tc>
@@ -2369,7 +2311,7 @@
               <w:rPr>
                 <w:sz w:val="17"/>
               </w:rPr>
-              <w:t>Traffic Acquisition</w:t>
+              <w:t>Traffic Conversion</w:t>
             </w:r>
           </w:p>
         </w:tc>
@@ -2383,7 +2325,7 @@
               <w:rPr>
                 <w:sz w:val="17"/>
               </w:rPr>
-              <w:t>#4.0 Live (+10pp realized); #6.0 Live (partial); #7.0 Deprioritized to Q4</w:t>
+              <w:t>Initiative #4.0 delivered +10pp; #6.0 live but unquantified; #7.0 deprioritized.</w:t>
             </w:r>
           </w:p>
         </w:tc>
@@ -2397,7 +2339,7 @@
               <w:rPr>
                 <w:sz w:val="17"/>
               </w:rPr>
-              <w:t>+10pp realized, +4pp deferred</w:t>
+              <w:t>+10pp realized</w:t>
             </w:r>
           </w:p>
         </w:tc>
@@ -2427,7 +2369,7 @@
               <w:rPr>
                 <w:sz w:val="17"/>
               </w:rPr>
-              <w:t>Submission &amp; Ticket Size</w:t>
+              <w:t>Submission &amp; Ticket</w:t>
             </w:r>
           </w:p>
         </w:tc>
@@ -2441,7 +2383,7 @@
               <w:rPr>
                 <w:sz w:val="17"/>
               </w:rPr>
-              <w:t>#8.0, #9.0 Live (0pp/0% realized); #10.0 Delayed</w:t>
+              <w:t>Initiatives #8.0, #9.0, #10.0 live/delayed; no metric movement observed.</w:t>
             </w:r>
           </w:p>
         </w:tc>
@@ -2455,7 +2397,7 @@
               <w:rPr>
                 <w:sz w:val="17"/>
               </w:rPr>
-              <w:t>0pp/0% realized</w:t>
+              <w:t>0pp / 0% realized</w:t>
             </w:r>
           </w:p>
         </w:tc>
@@ -2496,7 +2438,7 @@
         <w:rPr>
           <w:b w:val="0"/>
         </w:rPr>
-        <w:t>YTD disbursement stands at VNDm 277,174 vs plan VNDm 339,865 (-18% gap). To hit the FY plan of VNDm 1,879,405, the business must recover the -5pp approval rate gap immediately and accelerate the delayed structural initiatives (#2.0, #3.0). Without these, the current run-rate of VNDm 103,525/month implies a significant FY shortfall.</w:t>
+        <w:t>YTD disbursement is VNDm 277,174 vs plan VNDm 339,865 (-18%). To hit the FY plan of VNDm 1,879,405, the business must recover the 5pp approval rate gap and realize the +10% ticket size target. Success depends on the timely delivery of Initiative #3.0 (Sep-26) and resolving the API delays in Initiative #2.0.</w:t>
       </w:r>
     </w:p>
     <w:p>
@@ -2711,7 +2653,7 @@
               <w:rPr>
                 <w:sz w:val="17"/>
               </w:rPr>
-              <w:t>Đối tác yêu cầu bắt buộc API risk-based pricing chưa nằm trong scope, dự kiến delay sang tháng 10.</w:t>
+              <w:t>Đối tác yêu cầu bắt buộc risk-based pricing API, cần thêm 6-8 tuần dev và UAT, timeline khả thi nhất là tháng 10.</w:t>
             </w:r>
           </w:p>
         </w:tc>
@@ -2797,7 +2739,7 @@
               <w:rPr>
                 <w:sz w:val="17"/>
               </w:rPr>
-              <w:t>Do team Cashier full load và performance test chưa ổn định, đã đồng ý deprioritize và reschedule sang Q4.</w:t>
+              <w:t>Đã đồng ý deprioritize do team Cashier full load và performance test chưa ổn định, sẽ quay lại Q4 khi có resource.</w:t>
             </w:r>
           </w:p>
         </w:tc>
@@ -2869,7 +2811,7 @@
               <w:rPr>
                 <w:sz w:val="17"/>
               </w:rPr>
-              <w:t>nan</w:t>
+              <w:t>Aug-26</w:t>
             </w:r>
           </w:p>
         </w:tc>
@@ -2883,7 +2825,7 @@
               <w:rPr>
                 <w:sz w:val="17"/>
               </w:rPr>
-              <w:t>Không thể bắt đầu scoping do team DS đang ưu tiên init optimize model, timeline tháng 7 không khả thi.</w:t>
+              <w:t>Không thể kick off ngay tháng 6 do team DS đang ưu tiên init optimize model, cần 2 tháng để hoàn thiện sau khi model chạy positive.</w:t>
             </w:r>
           </w:p>
         </w:tc>
@@ -2993,7 +2935,7 @@
         <w:pStyle w:val="ListBullet"/>
       </w:pPr>
       <w:r>
-        <w:t>Initiative #2.0 (Persona 1): API risk-based pricing scope gap may extend delay beyond Oct-26, permanently reducing FY eligible base potential.</w:t>
+        <w:t>Initiative #2.0 (Persona 1): Risk of further delay beyond Oct-26 if risk-based pricing API development exceeds the 6-8 week estimate.</w:t>
       </w:r>
     </w:p>
     <w:p>
@@ -3001,7 +2943,7 @@
         <w:pStyle w:val="ListBullet"/>
       </w:pPr>
       <w:r>
-        <w:t>Initiative #3.0 (Persona 2): Low Gini on Model v1 may require further optimization, risking the Sep-26 launch timeline for new segments.</w:t>
+        <w:t>Initiative #3.0 (Persona 2): Risk that model optimization (Gini 0.3) does not translate to the expected +15pp eligible base lift upon Sep-26 launch.</w:t>
       </w:r>
     </w:p>
     <w:p>
@@ -3009,7 +2951,7 @@
         <w:pStyle w:val="ListBullet"/>
       </w:pPr>
       <w:r>
-        <w:t>Initiative #10.0 (Persona 2): DS team prioritization of model optimization over personalization scoping creates a dependency risk for July submission targets.</w:t>
+        <w:t>Initiative #9.0 (Persona 1): Risk that diverse product offerings fail to move Average Ticket Size if user demand remains price-sensitive.</w:t>
       </w:r>
     </w:p>
     <w:p>
@@ -3017,7 +2959,7 @@
         <w:pStyle w:val="ListBullet"/>
       </w:pPr>
       <w:r>
-        <w:t>Approval Rate Gap: No specific initiative is currently flagged as 'Live' to address the -5pp approval rate miss; risk of persistent underperformance vs plan.</w:t>
+        <w:t>Initiative #10.0 (Persona 2): Risk of continued delay if DS team cannot pivot from model optimization to personalization by Aug-26.</w:t>
       </w:r>
     </w:p>
     <w:sectPr>

</xml_diff>

<commit_message>
Email reading: a resolved blocker isn't a current blocker
Prompt now tells the model that when an older message said an initiative was
blocked/"cannot start" and a newer message says it is unblocked/"can kick off",
the details must describe the NEW state. Fixes #10 personalization details:
was "cannot kick off in June" (stale 15-Jun blocker) -> now "can kick off end
June (model ready), needs 2 months -> delayed to Aug-26".

Refresh Report_Sample + sample_emails.json accordingly.

Co-Authored-By: Claude Opus 4.8 (1M context) <noreply@anthropic.com>
</commit_message>
<xml_diff>
--- a/Report_Sample/Report/Report thang 6 nam 2026.docx
+++ b/Report_Sample/Report/Report thang 6 nam 2026.docx
@@ -1501,7 +1501,7 @@
         <w:t xml:space="preserve">Read: </w:t>
       </w:r>
       <w:r>
-        <w:t>Disbursement volume reached VNDm 98,596 in June, up 38% MoM but missing the VNDm 107,191 plan by 8%. The funnel shows a 38% MoM increase in traffic and approvals driven by a 10pp lift in traffic-to-eligible conversion, while approval rates and ticket sizes remained flat.</w:t>
+        <w:t>June 2026 disbursement volume reached VNDm 98,596, a +38% MoM increase driven by a 38% rise in traffic to the landing page. While the eligible base and approval rates remained flat, the traffic surge was the primary mechanical driver of volume growth. However, the month closed -8% vs plan due to a 5pp shortfall in the approval rate target.</w:t>
       </w:r>
     </w:p>
     <w:p>
@@ -1541,7 +1541,7 @@
         <w:t xml:space="preserve">Headline. </w:t>
       </w:r>
       <w:r>
-        <w:t>June disbursement hit VNDm 98,596 (+38% MoM) but missed plan by 8% (VNDm 107,191) due to a 5pp shortfall in approval rates despite a successful 10pp lift in traffic conversion.</w:t>
+        <w:t>Disbursement volume grew +38% MoM to VNDm 98,596, driven by a 38% traffic surge from new product launches, yet missed the VNDm 107,191 plan by -8% due to a 5pp approval rate gap.</w:t>
       </w:r>
     </w:p>
     <w:p>
@@ -1555,7 +1555,7 @@
         <w:t xml:space="preserve">MoM bridge (fact). </w:t>
       </w:r>
       <w:r>
-        <w:t>Disbursement growth of +38% decomposes into Eligible Base x1.05 (mechanical, +5% user base) and Traffic Conversion x1.31 (real, +10pp lift in %Traffic/Eligible); 1.05 x 1.31 ~= 1.38, i.e. +38%. Submission and Approval volumes grew mechanically (+38%) as conversion rates (%Submission/Traffic and %Approval Rate) remained flat at 14% and 65% respectively.</w:t>
+        <w:t>Volume growth of +38% decomposes into: Eligible Base x1.05 (Mechanical, +5%) x Traffic/Eligible x1.38 (Real, +10pp) x Submission/Traffic x1.00 (Flat) x Approval Rate x1.00 (Flat) x Ticket Size x1.00 (Flat). Arithmetic: 1.05 x 1.38 x 1.00 x 1.00 x 1.00 ~= 1.45 (approx +45% theoretical), adjusted for rounding in source data to match reported +38% volume growth.</w:t>
       </w:r>
     </w:p>
     <w:p>
@@ -1569,7 +1569,7 @@
         <w:t xml:space="preserve">Plan-miss bridge (fact). </w:t>
       </w:r>
       <w:r>
-        <w:t>The 8% miss (VNDm 8,595) is entirely driven by the Approval Rate gap: actual 65% vs plan 70% (-5pp). While Traffic to Landing Page met plan (10k vs 10k) and Eligible Base was on plan (23k vs 24k), the failure to lift approval rates offset the traffic gains.</w:t>
+        <w:t>The -8% volume miss (VNDm 8,595) is primarily attributed to the Approval Rate gap of -5pp (Actual 65% vs Plan 70%), which reduced approved volume by approx VNDm 8,595. Traffic and Eligible Base performed On Plan; the shortfall is entirely structural regarding risk appetite.</w:t>
       </w:r>
     </w:p>
     <w:p>
@@ -1590,7 +1590,7 @@
         <w:pStyle w:val="ListBullet"/>
       </w:pPr>
       <w:r>
-        <w:t>Initiative #1.0 (Persona 1, On Track): Partner integration completed in May; however, the promised +10pp impact on %Eligible/Total User Base was not realized in June (remained flat at 35%), indicating the partner volume has not yet scaled or the risk appetite threshold was not fully utilized.</w:t>
+        <w:t>Eligible Base: Flat at 35% of Total User Base; Initiative #1.0 (Persona 1, On Track) delivered +10pp vs April but did not move June vs May, indicating the base expansion is now mechanical. Initiative #2.0 (Persona 1, Delay) and #3.0 (Persona 2, On Track) remain future-looking.</w:t>
       </w:r>
     </w:p>
     <w:p>
@@ -1598,23 +1598,7 @@
         <w:pStyle w:val="ListBullet"/>
       </w:pPr>
       <w:r>
-        <w:t>Initiative #2.0 (Persona 1, Delay): Second high-risk partner delayed to Oct-26 due to mandatory risk-based pricing API requirements; +10pp impact on %Eligible/Total User Base is not yet measurable.</w:t>
-      </w:r>
-    </w:p>
-    <w:p>
-      <w:pPr>
-        <w:pStyle w:val="ListBullet"/>
-      </w:pPr>
-      <w:r>
-        <w:t>Initiative #3.0 (Persona 2, On Track): New scoring model targeting +15pp on %Eligible/Total User Base remains on track for Sep-26 launch; no impact in June.</w:t>
-      </w:r>
-    </w:p>
-    <w:p>
-      <w:pPr>
-        <w:pStyle w:val="ListBullet"/>
-      </w:pPr>
-      <w:r>
-        <w:t>Initiative #4.0 (Persona 3, Live): New product launched 7-Jun to unlock demand; successfully drove the +10pp lift in %Traffic/Eligible (32% to 42%), fully realizing the expected impact.</w:t>
+        <w:t>Approval Rate: Missed plan by -5pp (65% vs 70%); no structural initiative was live in June to unlock higher risk appetite beyond the baseline. The gap persists until Initiative #2.0 (Persona 1) lands in Oct-26 or #3.0 (Persona 2) in Sep-26.</w:t>
       </w:r>
     </w:p>
     <w:p>
@@ -1635,7 +1619,7 @@
         <w:pStyle w:val="ListBullet"/>
       </w:pPr>
       <w:r>
-        <w:t>Initiative #6.0 (Persona 3, Live): New traffic channel #1 live since Mar-26; contribution to the +10pp traffic lift is not yet isolated from Initiative #4.0.</w:t>
+        <w:t>Traffic/Eligible: +10pp MoM (32% to 42%) driven by Initiative #4.0 (Persona 3, Live), which unlocked new demand; this fully realized the +10pp impact target. Initiative #6.0 (Persona 3, Live) contributed +2pp, while #7.0 (Persona 3, Deprioritized) and #12.0 (Persona 3, Not started) provided no impact.</w:t>
       </w:r>
     </w:p>
     <w:p>
@@ -1643,47 +1627,7 @@
         <w:pStyle w:val="ListBullet"/>
       </w:pPr>
       <w:r>
-        <w:t>Initiative #7.0 (Persona 3, Deprioritized): Traffic channel #2 deprioritized due to Cashier team load; +2pp impact deferred to Q4.</w:t>
-      </w:r>
-    </w:p>
-    <w:p>
-      <w:pPr>
-        <w:pStyle w:val="ListBullet"/>
-      </w:pPr>
-      <w:r>
-        <w:t>Initiative #8.0 (Persona 1, Live): Landing page revamp live since Feb-26; %Submission/Traffic remained flat at 14%, suggesting the +2pp target is not yet realized or offset by other factors.</w:t>
-      </w:r>
-    </w:p>
-    <w:p>
-      <w:pPr>
-        <w:pStyle w:val="ListBullet"/>
-      </w:pPr>
-      <w:r>
-        <w:t>Initiative #9.0 (Persona 1, Live): Diverse offerings live since Mar-26; Average Ticket Size remained flat at VNDm 110, indicating the +10% target is not yet realized.</w:t>
-      </w:r>
-    </w:p>
-    <w:p>
-      <w:pPr>
-        <w:pStyle w:val="ListBullet"/>
-      </w:pPr>
-      <w:r>
-        <w:t>Initiative #10.0 (Persona 2, Delay): Personalization delayed to Aug-26 due to DS team prioritization; +2pp impact on %Submission/Traffic not yet measurable.</w:t>
-      </w:r>
-    </w:p>
-    <w:p>
-      <w:pPr>
-        <w:pStyle w:val="ListBullet"/>
-      </w:pPr>
-      <w:r>
-        <w:t>Initiative #11.0 (Persona 3, Deprioritized): Redirect tactics for dropped customers deprioritized; +0.5pp impact deferred to Q4.</w:t>
-      </w:r>
-    </w:p>
-    <w:p>
-      <w:pPr>
-        <w:pStyle w:val="ListBullet"/>
-      </w:pPr>
-      <w:r>
-        <w:t>Initiative #12.0 (Persona 3, Not started): Year-end campaign planning for Q3; no impact in June.</w:t>
+        <w:t>Submission/Traffic: Flat at 14%; Initiatives #8.0 (Persona 1, Live) and #9.0 (Persona 1, Live) are live but show no incremental lift in June conversion rates. Initiative #10.0 (Persona 2, Delay) and #11.0 (Persona 3, Deprioritized) are not yet active.</w:t>
       </w:r>
     </w:p>
     <w:p>
@@ -1709,7 +1653,7 @@
         <w:t xml:space="preserve">Run-rate. </w:t>
       </w:r>
       <w:r>
-        <w:t>July disbursement run-rate is VNDm 103,525 (+5% MoM vs June actual), which remains 23% below the July plan of VNDm 134,754.</w:t>
+        <w:t>July disbursement run-rate is VNDm 103,525 (+5% MoM), anchored on June actuals and known slips. This remains -23% vs the July plan of VNDm 134,754, as the approval rate gap persists and no new structural levers are scheduled for July.</w:t>
       </w:r>
     </w:p>
     <w:p>
@@ -1730,7 +1674,7 @@
         <w:pStyle w:val="ListBullet"/>
       </w:pPr>
       <w:r>
-        <w:t>Initiative #2.0 (Persona 1) remains delayed until Oct-26; no structural base expansion expected in July.</w:t>
+        <w:t>No structural initiatives scheduled for July; the next unlock is Initiative #3.0 (Persona 2) in Sep-26 (+15pp Eligible) and #2.0 (Persona 1) in Oct-26 (+10pp Eligible).</w:t>
       </w:r>
     </w:p>
     <w:p>
@@ -1738,7 +1682,7 @@
         <w:pStyle w:val="ListBullet"/>
       </w:pPr>
       <w:r>
-        <w:t>Initiative #3.0 (Persona 2) launch scheduled for Sep-26; no approval rate improvement expected in July.</w:t>
+        <w:t>Approval rate remains capped at 65% until new risk models or partners go live.</w:t>
       </w:r>
     </w:p>
     <w:p>
@@ -1759,7 +1703,7 @@
         <w:pStyle w:val="ListBullet"/>
       </w:pPr>
       <w:r>
-        <w:t>Initiative #10.0 (Persona 2) delayed to Aug-26; no submission rate lift expected in July.</w:t>
+        <w:t>Initiative #10.0 (Persona 2, Delay) is expected to kick off end of June for Aug-26 delivery; no impact in July.</w:t>
       </w:r>
     </w:p>
     <w:p>
@@ -1767,7 +1711,7 @@
         <w:pStyle w:val="ListBullet"/>
       </w:pPr>
       <w:r>
-        <w:t>Initiative #7.0 and #11.0 remain deprioritized; no incremental traffic or submission gains expected in July.</w:t>
+        <w:t>Initiative #7.0 (Persona 3, Deprioritized) and #11.0 (Persona 3, Deprioritized) remain inactive; no traffic or submission lift expected in July.</w:t>
       </w:r>
     </w:p>
     <w:p>
@@ -1903,7 +1847,7 @@
               <w:rPr>
                 <w:sz w:val="17"/>
               </w:rPr>
-              <w:t>Initiative #2.0 (Persona 1) &amp; #3.0 (Persona 2)</w:t>
+              <w:t>Initiative #2.0 (Persona 1)</w:t>
             </w:r>
           </w:p>
         </w:tc>
@@ -1917,7 +1861,7 @@
               <w:rPr>
                 <w:sz w:val="17"/>
               </w:rPr>
-              <w:t>Close the 5pp gap vs plan (65% actual vs 70% target) to unlock disbursement volume; critical as traffic levers are already maximized.</w:t>
+              <w:t>Resolve the -5pp approval gap to hit volume plans; currently delayed to Oct-26 due to API requirements.</w:t>
             </w:r>
           </w:p>
         </w:tc>
@@ -1947,7 +1891,7 @@
               <w:rPr>
                 <w:sz w:val="17"/>
               </w:rPr>
-              <w:t>Incremental — Ticket Size</w:t>
+              <w:t>Structural — Eligible Base</w:t>
             </w:r>
           </w:p>
         </w:tc>
@@ -1961,7 +1905,7 @@
               <w:rPr>
                 <w:sz w:val="17"/>
               </w:rPr>
-              <w:t>Initiative #9.0 (Persona 1)</w:t>
+              <w:t>Initiative #3.0 (Persona 2)</w:t>
             </w:r>
           </w:p>
         </w:tc>
@@ -1975,7 +1919,65 @@
               <w:rPr>
                 <w:sz w:val="17"/>
               </w:rPr>
-              <w:t>Realize the +10% ticket size target to drive volume without increasing approval risk; currently flat at VNDm 110.</w:t>
+              <w:t>Unlock +15pp eligible base in Sep-26 to drive long-term volume growth.</w:t>
+            </w:r>
+          </w:p>
+        </w:tc>
+      </w:tr>
+      <w:tr>
+        <w:tc>
+          <w:tcPr>
+            <w:tcW w:type="dxa" w:w="2160"/>
+          </w:tcPr>
+          <w:p>
+            <w:r/>
+            <w:r>
+              <w:rPr>
+                <w:sz w:val="17"/>
+              </w:rPr>
+              <w:t>3</w:t>
+            </w:r>
+          </w:p>
+        </w:tc>
+        <w:tc>
+          <w:tcPr>
+            <w:tcW w:type="dxa" w:w="2160"/>
+          </w:tcPr>
+          <w:p>
+            <w:r/>
+            <w:r>
+              <w:rPr>
+                <w:sz w:val="17"/>
+              </w:rPr>
+              <w:t>Incremental — Submission Rate</w:t>
+            </w:r>
+          </w:p>
+        </w:tc>
+        <w:tc>
+          <w:tcPr>
+            <w:tcW w:type="dxa" w:w="2160"/>
+          </w:tcPr>
+          <w:p>
+            <w:r/>
+            <w:r>
+              <w:rPr>
+                <w:sz w:val="17"/>
+              </w:rPr>
+              <w:t>Initiative #10.0 (Persona 2)</w:t>
+            </w:r>
+          </w:p>
+        </w:tc>
+        <w:tc>
+          <w:tcPr>
+            <w:tcW w:type="dxa" w:w="2160"/>
+          </w:tcPr>
+          <w:p>
+            <w:r/>
+            <w:r>
+              <w:rPr>
+                <w:sz w:val="17"/>
+              </w:rPr>
+              <w:t>Personalize offerings to lift submission rate; currently delayed to Aug-26.</w:t>
             </w:r>
           </w:p>
         </w:tc>
@@ -2113,7 +2115,7 @@
               <w:rPr>
                 <w:sz w:val="17"/>
               </w:rPr>
-              <w:t>Initiative #1.0 live but impact not yet visible; #2.0 delayed to Oct-26; #3.0 on track for Sep-26.</w:t>
+              <w:t>Initiative #1.0 landed (+10pp vs Apr); #2.0 delayed to Oct-26; #3.0 on track for Sep-26.</w:t>
             </w:r>
           </w:p>
         </w:tc>
@@ -2127,7 +2129,7 @@
               <w:rPr>
                 <w:sz w:val="17"/>
               </w:rPr>
-              <w:t>Medium</w:t>
+              <w:t>High</w:t>
             </w:r>
           </w:p>
         </w:tc>
@@ -2141,7 +2143,7 @@
               <w:rPr>
                 <w:sz w:val="17"/>
               </w:rPr>
-              <w:t>Behind</w:t>
+              <w:t>On track</w:t>
             </w:r>
           </w:p>
         </w:tc>
@@ -2171,7 +2173,7 @@
               <w:rPr>
                 <w:sz w:val="17"/>
               </w:rPr>
-              <w:t>No new models live in June; #3.0 pending Sep-26.</w:t>
+              <w:t>No new levers landed in June; #2.0 delayed to Oct-26.</w:t>
             </w:r>
           </w:p>
         </w:tc>
@@ -2185,7 +2187,7 @@
               <w:rPr>
                 <w:sz w:val="17"/>
               </w:rPr>
-              <w:t>High</w:t>
+              <w:t>Medium</w:t>
             </w:r>
           </w:p>
         </w:tc>
@@ -2199,7 +2201,7 @@
               <w:rPr>
                 <w:sz w:val="17"/>
               </w:rPr>
-              <w:t>On track</w:t>
+              <w:t>Behind</w:t>
             </w:r>
           </w:p>
         </w:tc>
@@ -2311,7 +2313,7 @@
               <w:rPr>
                 <w:sz w:val="17"/>
               </w:rPr>
-              <w:t>Traffic Conversion</w:t>
+              <w:t>Traffic Acquisition</w:t>
             </w:r>
           </w:p>
         </w:tc>
@@ -2325,7 +2327,7 @@
               <w:rPr>
                 <w:sz w:val="17"/>
               </w:rPr>
-              <w:t>Initiative #4.0 delivered +10pp; #6.0 live but unquantified; #7.0 deprioritized.</w:t>
+              <w:t>Initiative #4.0 landed (+10pp); #6.0 landed (+2pp); #7.0 deprioritized; #12.0 not started.</w:t>
             </w:r>
           </w:p>
         </w:tc>
@@ -2339,7 +2341,7 @@
               <w:rPr>
                 <w:sz w:val="17"/>
               </w:rPr>
-              <w:t>+10pp realized</w:t>
+              <w:t>+12pp realized</w:t>
             </w:r>
           </w:p>
         </w:tc>
@@ -2369,7 +2371,7 @@
               <w:rPr>
                 <w:sz w:val="17"/>
               </w:rPr>
-              <w:t>Submission &amp; Ticket</w:t>
+              <w:t>Conversion Optimization</w:t>
             </w:r>
           </w:p>
         </w:tc>
@@ -2383,7 +2385,7 @@
               <w:rPr>
                 <w:sz w:val="17"/>
               </w:rPr>
-              <w:t>Initiatives #8.0, #9.0, #10.0 live/delayed; no metric movement observed.</w:t>
+              <w:t>Initiatives #8.0, #9.0 live but no measurable lift yet; #10.0 delayed to Aug-26.</w:t>
             </w:r>
           </w:p>
         </w:tc>
@@ -2397,7 +2399,7 @@
               <w:rPr>
                 <w:sz w:val="17"/>
               </w:rPr>
-              <w:t>0pp / 0% realized</w:t>
+              <w:t>0pp realized</w:t>
             </w:r>
           </w:p>
         </w:tc>
@@ -2438,7 +2440,7 @@
         <w:rPr>
           <w:b w:val="0"/>
         </w:rPr>
-        <w:t>YTD disbursement is VNDm 277,174 vs plan VNDm 339,865 (-18%). To hit the FY plan of VNDm 1,879,405, the business must recover the 5pp approval rate gap and realize the +10% ticket size target. Success depends on the timely delivery of Initiative #3.0 (Sep-26) and resolving the API delays in Initiative #2.0.</w:t>
+        <w:t>YTD Disbursement is VNDm 277,174 vs Plan VNDm 339,865 (-18% gap). To hit the FY plan of VNDm 1,879,405, the business must recover the approval rate gap in Q3/Q4 via Initiatives #2.0 and #3.0. Current run-rate suggests a significant shortfall unless the delayed structural initiatives accelerate or the approval rate improves organically.</w:t>
       </w:r>
     </w:p>
     <w:p>
@@ -2653,7 +2655,7 @@
               <w:rPr>
                 <w:sz w:val="17"/>
               </w:rPr>
-              <w:t>Đối tác yêu cầu bắt buộc risk-based pricing API, cần thêm 6-8 tuần dev và UAT, timeline khả thi nhất là tháng 10.</w:t>
+              <w:t>Partner yêu cầu bắt buộc risk-based pricing API, cần thêm 6-8 tuần dev và UAT, timeline khả thi nhất là tháng 10.</w:t>
             </w:r>
           </w:p>
         </w:tc>
@@ -2739,7 +2741,7 @@
               <w:rPr>
                 <w:sz w:val="17"/>
               </w:rPr>
-              <w:t>Đã đồng ý deprioritize do team Cashier full load và performance test chưa ổn định, sẽ quay lại Q4 khi có resource.</w:t>
+              <w:t>Do team Cashier full load và performance test chưa ổn định, hai bên đồng ý deprioritize và sẽ quay lại trong Q4 khi có resource.</w:t>
             </w:r>
           </w:p>
         </w:tc>
@@ -2825,7 +2827,7 @@
               <w:rPr>
                 <w:sz w:val="17"/>
               </w:rPr>
-              <w:t>Không thể kick off ngay tháng 6 do team DS đang ưu tiên init optimize model, cần 2 tháng để hoàn thiện sau khi model chạy positive.</w:t>
+              <w:t>Do team DS ưu tiên init optimize model, init này chưa thể scoping ngay, dự kiến kick off cuối tháng 6 và cần 2 tháng để hoàn thiện.</w:t>
             </w:r>
           </w:p>
         </w:tc>
@@ -2935,7 +2937,7 @@
         <w:pStyle w:val="ListBullet"/>
       </w:pPr>
       <w:r>
-        <w:t>Initiative #2.0 (Persona 1): Risk of further delay beyond Oct-26 if risk-based pricing API development exceeds the 6-8 week estimate.</w:t>
+        <w:t>Initiative #2.0 (Persona 1): Delayed to Oct-26 due to mandatory risk-based pricing API requirements; 6-8 weeks dev/UAT needed. Risk: Approval rate remains below plan for 4+ months.</w:t>
       </w:r>
     </w:p>
     <w:p>
@@ -2943,7 +2945,7 @@
         <w:pStyle w:val="ListBullet"/>
       </w:pPr>
       <w:r>
-        <w:t>Initiative #3.0 (Persona 2): Risk that model optimization (Gini 0.3) does not translate to the expected +15pp eligible base lift upon Sep-26 launch.</w:t>
+        <w:t>Initiative #10.0 (Persona 2): Delayed to Aug-26 due to DS team prioritization; risk of missing Q3 submission targets.</w:t>
       </w:r>
     </w:p>
     <w:p>
@@ -2951,7 +2953,7 @@
         <w:pStyle w:val="ListBullet"/>
       </w:pPr>
       <w:r>
-        <w:t>Initiative #9.0 (Persona 1): Risk that diverse product offerings fail to move Average Ticket Size if user demand remains price-sensitive.</w:t>
+        <w:t>Initiative #12.0 (Persona 3): Year-end campaign not started; creative and budget unconfirmed. Risk: Q4 traffic targets may be missed.</w:t>
       </w:r>
     </w:p>
     <w:p>
@@ -2959,7 +2961,7 @@
         <w:pStyle w:val="ListBullet"/>
       </w:pPr>
       <w:r>
-        <w:t>Initiative #10.0 (Persona 2): Risk of continued delay if DS team cannot pivot from model optimization to personalization by Aug-26.</w:t>
+        <w:t>Initiative #7.0 &amp; #11.0 (Persona 3): Deprioritized due to resource constraints; risk of missing incremental traffic/submission upside in Q4.</w:t>
       </w:r>
     </w:p>
     <w:sectPr>

</xml_diff>

<commit_message>
2-pass thread→initiative mapping: merge same-initiative threads, fix #1/#2
Adds a cheap Pass-1 LLM call mapping each email thread to initiative No(s), then:
- MERGES threads that concern the same single initiative (e.g. "Partner 2 —
  onboarding" + "Onboard Partner A" -> #2) so the latest decision wins → #2 now
  reads the phased plan (Phase 1 ~Sep, 1M users; Phase 2 later).
- Leaves multi-initiative threads as-is (no cross-contamination) → #3/#10 stay correct.
- Completeness sweep: no-email, past-due, ready/deployed items roll to Live (Rule B)
  → #1 (ready-to-pilot May) becomes Live in June.
- max_tokens 8000 + _chat_json/_json_obj helpers (supports reasoning models too).

Verified stable: #1 Live, #2 Sep-26 phased, #3 On Track Sep-26, #10 Delay Aug-26.

Co-Authored-By: Claude Opus 4.8 (1M context) <noreply@anthropic.com>
</commit_message>
<xml_diff>
--- a/Report_Sample/Report/Report thang 6 nam 2026.docx
+++ b/Report_Sample/Report/Report thang 6 nam 2026.docx
@@ -1501,7 +1501,7 @@
         <w:t xml:space="preserve">Read: </w:t>
       </w:r>
       <w:r>
-        <w:t>June 2026 disbursement volume reached VNDm 98,596, a +38% MoM increase driven by a 38% rise in traffic to the landing page. While the eligible base and approval rates remained flat, the traffic surge was the primary mechanical driver of volume growth. However, the month closed -8% vs plan due to a 5pp shortfall in the approval rate target.</w:t>
+        <w:t>June 2026 Disbursement Volume reached VNDm 98,596, a +38% MoM increase driven by a 38% rise in Approved loans, while remaining -8% vs Plan. The funnel expanded mechanically through a +5% growth in Eligible Base and a +10pp uplift in Traffic-to-Eligible conversion, though the Approval Rate remained flat at 65%.</w:t>
       </w:r>
     </w:p>
     <w:p>
@@ -1541,7 +1541,7 @@
         <w:t xml:space="preserve">Headline. </w:t>
       </w:r>
       <w:r>
-        <w:t>Disbursement volume grew +38% MoM to VNDm 98,596, driven by a 38% traffic surge from new product launches, yet missed the VNDm 107,191 plan by -8% due to a 5pp approval rate gap.</w:t>
+        <w:t>Disbursement Volume hit VNDm 98,596 (+38% MoM) but missed the VNDm 107,191 plan by -8%. Growth was driven by a 38% increase in Approved loans, stemming from a 38% surge in Traffic (real) and a 5% expansion in Eligible Base (mechanical), offset by a -5pp shortfall in Approval Rate vs Plan.</w:t>
       </w:r>
     </w:p>
     <w:p>
@@ -1555,7 +1555,7 @@
         <w:t xml:space="preserve">MoM bridge (fact). </w:t>
       </w:r>
       <w:r>
-        <w:t>Volume growth of +38% decomposes into: Eligible Base x1.05 (Mechanical, +5%) x Traffic/Eligible x1.38 (Real, +10pp) x Submission/Traffic x1.00 (Flat) x Approval Rate x1.00 (Flat) x Ticket Size x1.00 (Flat). Arithmetic: 1.05 x 1.38 x 1.00 x 1.00 x 1.00 ~= 1.45 (approx +45% theoretical), adjusted for rounding in source data to match reported +38% volume growth.</w:t>
+        <w:t>Disbursement Volume +38% decomposes into: Eligible Base x1.05 (Mechanical) x Traffic/Eligible x1.31 (Real, +10pp) x Submission/Traffic x1.00 (Flat) x Approval Rate x1.00 (Flat) x Ticket Size x1.00 (Flat). Arithmetic: 1.05 x 1.31 x 1.00 x 1.00 x 1.00 ~= 1.38, i.e. +38%.</w:t>
       </w:r>
     </w:p>
     <w:p>
@@ -1569,7 +1569,7 @@
         <w:t xml:space="preserve">Plan-miss bridge (fact). </w:t>
       </w:r>
       <w:r>
-        <w:t>The -8% volume miss (VNDm 8,595) is primarily attributed to the Approval Rate gap of -5pp (Actual 65% vs Plan 70%), which reduced approved volume by approx VNDm 8,595. Traffic and Eligible Base performed On Plan; the shortfall is entirely structural regarding risk appetite.</w:t>
+        <w:t>The -8% gap to Plan (VNDm 107,191) is primarily driven by the Approval Rate missing its 70% target by -5pp (Actual 65%), despite Traffic and Eligible Base performing on plan. The flat Approval Rate negated the volume gains from the +10pp Traffic uplift, preventing the realization of the full plan volume.</w:t>
       </w:r>
     </w:p>
     <w:p>
@@ -1590,7 +1590,7 @@
         <w:pStyle w:val="ListBullet"/>
       </w:pPr>
       <w:r>
-        <w:t>Eligible Base: Flat at 35% of Total User Base; Initiative #1.0 (Persona 1, On Track) delivered +10pp vs April but did not move June vs May, indicating the base expansion is now mechanical. Initiative #2.0 (Persona 1, Delay) and #3.0 (Persona 2, On Track) remain future-looking.</w:t>
+        <w:t>Eligible Base: +5% MoM growth (Mechanical) aligns with Initiative #1.0 (Persona 1, Live), which targeted +10pp %Eligible/Total; however, the metric remained flat at 35%, suggesting the +5% base growth was driven by overall user base expansion rather than the partner integration's full impact yet.</w:t>
       </w:r>
     </w:p>
     <w:p>
@@ -1598,7 +1598,7 @@
         <w:pStyle w:val="ListBullet"/>
       </w:pPr>
       <w:r>
-        <w:t>Approval Rate: Missed plan by -5pp (65% vs 70%); no structural initiative was live in June to unlock higher risk appetite beyond the baseline. The gap persists until Initiative #2.0 (Persona 1) lands in Oct-26 or #3.0 (Persona 2) in Sep-26.</w:t>
+        <w:t>Approval Rate: Flat at 65% MoM (-5pp vs Plan 70%); no structural initiative (#3.0) has landed yet (scheduled Sep-26), leaving the scoring model unchanged and the rate below target.</w:t>
       </w:r>
     </w:p>
     <w:p>
@@ -1619,7 +1619,7 @@
         <w:pStyle w:val="ListBullet"/>
       </w:pPr>
       <w:r>
-        <w:t>Traffic/Eligible: +10pp MoM (32% to 42%) driven by Initiative #4.0 (Persona 3, Live), which unlocked new demand; this fully realized the +10pp impact target. Initiative #6.0 (Persona 3, Live) contributed +2pp, while #7.0 (Persona 3, Deprioritized) and #12.0 (Persona 3, Not started) provided no impact.</w:t>
+        <w:t>Traffic/Eligible: +10pp MoM (Real) vs Plan 42% (On Plan). This uplift is attributed to Initiative #4.0 (Persona 3, Live, Jun-26) targeting +10pp, fully realized in June. Initiative #6.0 (Persona 3, Live) contributed +2pp but is subsumed in the total.</w:t>
       </w:r>
     </w:p>
     <w:p>
@@ -1627,7 +1627,15 @@
         <w:pStyle w:val="ListBullet"/>
       </w:pPr>
       <w:r>
-        <w:t>Submission/Traffic: Flat at 14%; Initiatives #8.0 (Persona 1, Live) and #9.0 (Persona 1, Live) are live but show no incremental lift in June conversion rates. Initiative #10.0 (Persona 2, Delay) and #11.0 (Persona 3, Deprioritized) are not yet active.</w:t>
+        <w:t>Submission/Traffic: Flat at 14% MoM (On Plan). Initiatives #8.0 (Persona 1, Live) and #9.0 (Persona 1, Live) targeted +2pp and +2pp respectively; however, the metric remained flat, indicating these layout and diversity changes have not yet translated into submission rate improvements.</w:t>
+      </w:r>
+    </w:p>
+    <w:p>
+      <w:pPr>
+        <w:pStyle w:val="ListBullet"/>
+      </w:pPr>
+      <w:r>
+        <w:t>Ticket Size: Flat at VNDm 110 (On Plan). Initiative #9.0 (Persona 1, Live) targeted +10% ticket size; this impact is not yet realized in the June actuals.</w:t>
       </w:r>
     </w:p>
     <w:p>
@@ -1653,7 +1661,7 @@
         <w:t xml:space="preserve">Run-rate. </w:t>
       </w:r>
       <w:r>
-        <w:t>July disbursement run-rate is VNDm 103,525 (+5% MoM), anchored on June actuals and known slips. This remains -23% vs the July plan of VNDm 134,754, as the approval rate gap persists and no new structural levers are scheduled for July.</w:t>
+        <w:t>July Disbursement run-rate is projected at VNDm 103,525 (+5% MoM vs June), which remains -23% vs the July Plan of VNDm 134,754. This projection assumes current conversion rates persist without the delayed structural or incremental initiatives.</w:t>
       </w:r>
     </w:p>
     <w:p>
@@ -1674,7 +1682,7 @@
         <w:pStyle w:val="ListBullet"/>
       </w:pPr>
       <w:r>
-        <w:t>No structural initiatives scheduled for July; the next unlock is Initiative #3.0 (Persona 2) in Sep-26 (+15pp Eligible) and #2.0 (Persona 1) in Oct-26 (+10pp Eligible).</w:t>
+        <w:t>Approval Rate remains the primary constraint; Initiative #3.0 (Persona 2) is On Track for Sep-26, meaning no structural scoring improvement is expected in July.</w:t>
       </w:r>
     </w:p>
     <w:p>
@@ -1682,7 +1690,7 @@
         <w:pStyle w:val="ListBullet"/>
       </w:pPr>
       <w:r>
-        <w:t>Approval rate remains capped at 65% until new risk models or partners go live.</w:t>
+        <w:t>Eligible Base growth relies on Initiative #2.0 (Persona 1), which is Delayed to Sep-26; no additional base expansion from this partner is expected in July.</w:t>
       </w:r>
     </w:p>
     <w:p>
@@ -1703,7 +1711,7 @@
         <w:pStyle w:val="ListBullet"/>
       </w:pPr>
       <w:r>
-        <w:t>Initiative #10.0 (Persona 2, Delay) is expected to kick off end of June for Aug-26 delivery; no impact in July.</w:t>
+        <w:t>Initiative #10.0 (Persona 2) is Delayed to Aug-26; the targeted +2pp submission uplift will not materialize in July.</w:t>
       </w:r>
     </w:p>
     <w:p>
@@ -1711,7 +1719,15 @@
         <w:pStyle w:val="ListBullet"/>
       </w:pPr>
       <w:r>
-        <w:t>Initiative #7.0 (Persona 3, Deprioritized) and #11.0 (Persona 3, Deprioritized) remain inactive; no traffic or submission lift expected in July.</w:t>
+        <w:t>Initiative #7.0 (Persona 3) is Deprioritized to Q4-2026; the +2pp traffic impact is removed from the July forecast.</w:t>
+      </w:r>
+    </w:p>
+    <w:p>
+      <w:pPr>
+        <w:pStyle w:val="ListBullet"/>
+      </w:pPr>
+      <w:r>
+        <w:t>Initiative #12.0 (Persona 3) is Not Started; the +5pp traffic impact is excluded from the July run-rate.</w:t>
       </w:r>
     </w:p>
     <w:p>
@@ -1847,7 +1863,7 @@
               <w:rPr>
                 <w:sz w:val="17"/>
               </w:rPr>
-              <w:t>Initiative #2.0 (Persona 1)</w:t>
+              <w:t>Initiative #3.0 (Persona 2)</w:t>
             </w:r>
           </w:p>
         </w:tc>
@@ -1861,7 +1877,7 @@
               <w:rPr>
                 <w:sz w:val="17"/>
               </w:rPr>
-              <w:t>Resolve the -5pp approval gap to hit volume plans; currently delayed to Oct-26 due to API requirements.</w:t>
+              <w:t>Unlock +15pp Eligible Base and improve scoring to close the -5pp gap vs Plan; critical for FY volume.</w:t>
             </w:r>
           </w:p>
         </w:tc>
@@ -1878,64 +1894,6 @@
                 <w:sz w:val="17"/>
               </w:rPr>
               <w:t>2</w:t>
-            </w:r>
-          </w:p>
-        </w:tc>
-        <w:tc>
-          <w:tcPr>
-            <w:tcW w:type="dxa" w:w="2160"/>
-          </w:tcPr>
-          <w:p>
-            <w:r/>
-            <w:r>
-              <w:rPr>
-                <w:sz w:val="17"/>
-              </w:rPr>
-              <w:t>Structural — Eligible Base</w:t>
-            </w:r>
-          </w:p>
-        </w:tc>
-        <w:tc>
-          <w:tcPr>
-            <w:tcW w:type="dxa" w:w="2160"/>
-          </w:tcPr>
-          <w:p>
-            <w:r/>
-            <w:r>
-              <w:rPr>
-                <w:sz w:val="17"/>
-              </w:rPr>
-              <w:t>Initiative #3.0 (Persona 2)</w:t>
-            </w:r>
-          </w:p>
-        </w:tc>
-        <w:tc>
-          <w:tcPr>
-            <w:tcW w:type="dxa" w:w="2160"/>
-          </w:tcPr>
-          <w:p>
-            <w:r/>
-            <w:r>
-              <w:rPr>
-                <w:sz w:val="17"/>
-              </w:rPr>
-              <w:t>Unlock +15pp eligible base in Sep-26 to drive long-term volume growth.</w:t>
-            </w:r>
-          </w:p>
-        </w:tc>
-      </w:tr>
-      <w:tr>
-        <w:tc>
-          <w:tcPr>
-            <w:tcW w:type="dxa" w:w="2160"/>
-          </w:tcPr>
-          <w:p>
-            <w:r/>
-            <w:r>
-              <w:rPr>
-                <w:sz w:val="17"/>
-              </w:rPr>
-              <w:t>3</w:t>
             </w:r>
           </w:p>
         </w:tc>
@@ -1977,7 +1935,65 @@
               <w:rPr>
                 <w:sz w:val="17"/>
               </w:rPr>
-              <w:t>Personalize offerings to lift submission rate; currently delayed to Aug-26.</w:t>
+              <w:t>Resolve delay to capture +2pp submission uplift; currently flat at 14% despite prior layout changes.</w:t>
+            </w:r>
+          </w:p>
+        </w:tc>
+      </w:tr>
+      <w:tr>
+        <w:tc>
+          <w:tcPr>
+            <w:tcW w:type="dxa" w:w="2160"/>
+          </w:tcPr>
+          <w:p>
+            <w:r/>
+            <w:r>
+              <w:rPr>
+                <w:sz w:val="17"/>
+              </w:rPr>
+              <w:t>3</w:t>
+            </w:r>
+          </w:p>
+        </w:tc>
+        <w:tc>
+          <w:tcPr>
+            <w:tcW w:type="dxa" w:w="2160"/>
+          </w:tcPr>
+          <w:p>
+            <w:r/>
+            <w:r>
+              <w:rPr>
+                <w:sz w:val="17"/>
+              </w:rPr>
+              <w:t>Structural — Eligible Base</w:t>
+            </w:r>
+          </w:p>
+        </w:tc>
+        <w:tc>
+          <w:tcPr>
+            <w:tcW w:type="dxa" w:w="2160"/>
+          </w:tcPr>
+          <w:p>
+            <w:r/>
+            <w:r>
+              <w:rPr>
+                <w:sz w:val="17"/>
+              </w:rPr>
+              <w:t>Initiative #2.0 (Persona 1)</w:t>
+            </w:r>
+          </w:p>
+        </w:tc>
+        <w:tc>
+          <w:tcPr>
+            <w:tcW w:type="dxa" w:w="2160"/>
+          </w:tcPr>
+          <w:p>
+            <w:r/>
+            <w:r>
+              <w:rPr>
+                <w:sz w:val="17"/>
+              </w:rPr>
+              <w:t>Accelerate delayed partner integration to Sep-26 to secure +10pp eligible base expansion.</w:t>
             </w:r>
           </w:p>
         </w:tc>
@@ -2101,7 +2117,7 @@
               <w:rPr>
                 <w:sz w:val="17"/>
               </w:rPr>
-              <w:t>Eligible Base Expansion</w:t>
+              <w:t>Partner Integration (Risk Appetite)</w:t>
             </w:r>
           </w:p>
         </w:tc>
@@ -2115,7 +2131,65 @@
               <w:rPr>
                 <w:sz w:val="17"/>
               </w:rPr>
-              <w:t>Initiative #1.0 landed (+10pp vs Apr); #2.0 delayed to Oct-26; #3.0 on track for Sep-26.</w:t>
+              <w:t>Initiative #1.0 Live (May-26); Initiative #2.0 Delayed to Sep-26</w:t>
+            </w:r>
+          </w:p>
+        </w:tc>
+        <w:tc>
+          <w:tcPr>
+            <w:tcW w:type="dxa" w:w="2160"/>
+          </w:tcPr>
+          <w:p>
+            <w:r/>
+            <w:r>
+              <w:rPr>
+                <w:sz w:val="17"/>
+              </w:rPr>
+              <w:t>Medium</w:t>
+            </w:r>
+          </w:p>
+        </w:tc>
+        <w:tc>
+          <w:tcPr>
+            <w:tcW w:type="dxa" w:w="2160"/>
+          </w:tcPr>
+          <w:p>
+            <w:r/>
+            <w:r>
+              <w:rPr>
+                <w:sz w:val="17"/>
+              </w:rPr>
+              <w:t>Behind</w:t>
+            </w:r>
+          </w:p>
+        </w:tc>
+      </w:tr>
+      <w:tr>
+        <w:tc>
+          <w:tcPr>
+            <w:tcW w:type="dxa" w:w="2160"/>
+          </w:tcPr>
+          <w:p>
+            <w:r/>
+            <w:r>
+              <w:rPr>
+                <w:sz w:val="17"/>
+              </w:rPr>
+              <w:t>Scoring Models</w:t>
+            </w:r>
+          </w:p>
+        </w:tc>
+        <w:tc>
+          <w:tcPr>
+            <w:tcW w:type="dxa" w:w="2160"/>
+          </w:tcPr>
+          <w:p>
+            <w:r/>
+            <w:r>
+              <w:rPr>
+                <w:sz w:val="17"/>
+              </w:rPr>
+              <w:t>Initiative #3.0 On Track for Sep-26</w:t>
             </w:r>
           </w:p>
         </w:tc>
@@ -2144,64 +2218,6 @@
                 <w:sz w:val="17"/>
               </w:rPr>
               <w:t>On track</w:t>
-            </w:r>
-          </w:p>
-        </w:tc>
-      </w:tr>
-      <w:tr>
-        <w:tc>
-          <w:tcPr>
-            <w:tcW w:type="dxa" w:w="2160"/>
-          </w:tcPr>
-          <w:p>
-            <w:r/>
-            <w:r>
-              <w:rPr>
-                <w:sz w:val="17"/>
-              </w:rPr>
-              <w:t>Approval Rate Optimization</w:t>
-            </w:r>
-          </w:p>
-        </w:tc>
-        <w:tc>
-          <w:tcPr>
-            <w:tcW w:type="dxa" w:w="2160"/>
-          </w:tcPr>
-          <w:p>
-            <w:r/>
-            <w:r>
-              <w:rPr>
-                <w:sz w:val="17"/>
-              </w:rPr>
-              <w:t>No new levers landed in June; #2.0 delayed to Oct-26.</w:t>
-            </w:r>
-          </w:p>
-        </w:tc>
-        <w:tc>
-          <w:tcPr>
-            <w:tcW w:type="dxa" w:w="2160"/>
-          </w:tcPr>
-          <w:p>
-            <w:r/>
-            <w:r>
-              <w:rPr>
-                <w:sz w:val="17"/>
-              </w:rPr>
-              <w:t>Medium</w:t>
-            </w:r>
-          </w:p>
-        </w:tc>
-        <w:tc>
-          <w:tcPr>
-            <w:tcW w:type="dxa" w:w="2160"/>
-          </w:tcPr>
-          <w:p>
-            <w:r/>
-            <w:r>
-              <w:rPr>
-                <w:sz w:val="17"/>
-              </w:rPr>
-              <w:t>Behind</w:t>
             </w:r>
           </w:p>
         </w:tc>
@@ -2313,7 +2329,7 @@
               <w:rPr>
                 <w:sz w:val="17"/>
               </w:rPr>
-              <w:t>Traffic Acquisition</w:t>
+              <w:t>Traffic Channels</w:t>
             </w:r>
           </w:p>
         </w:tc>
@@ -2327,7 +2343,7 @@
               <w:rPr>
                 <w:sz w:val="17"/>
               </w:rPr>
-              <w:t>Initiative #4.0 landed (+10pp); #6.0 landed (+2pp); #7.0 deprioritized; #12.0 not started.</w:t>
+              <w:t>Initiative #4.0 Live (Jun-26); #6.0 Live; #7.0 Deprioritized to Q4</w:t>
             </w:r>
           </w:p>
         </w:tc>
@@ -2341,7 +2357,7 @@
               <w:rPr>
                 <w:sz w:val="17"/>
               </w:rPr>
-              <w:t>+12pp realized</w:t>
+              <w:t>+10pp realized (Jun); +2pp deferred</w:t>
             </w:r>
           </w:p>
         </w:tc>
@@ -2371,7 +2387,7 @@
               <w:rPr>
                 <w:sz w:val="17"/>
               </w:rPr>
-              <w:t>Conversion Optimization</w:t>
+              <w:t>Submission Conversion</w:t>
             </w:r>
           </w:p>
         </w:tc>
@@ -2385,7 +2401,7 @@
               <w:rPr>
                 <w:sz w:val="17"/>
               </w:rPr>
-              <w:t>Initiatives #8.0, #9.0 live but no measurable lift yet; #10.0 delayed to Aug-26.</w:t>
+              <w:t>Initiative #8.0 &amp; #9.0 Live (Feb/Mar-26); #10.0 Delayed to Aug-26</w:t>
             </w:r>
           </w:p>
         </w:tc>
@@ -2399,7 +2415,65 @@
               <w:rPr>
                 <w:sz w:val="17"/>
               </w:rPr>
-              <w:t>0pp realized</w:t>
+              <w:t>0pp realized (Flat); +2pp deferred</w:t>
+            </w:r>
+          </w:p>
+        </w:tc>
+        <w:tc>
+          <w:tcPr>
+            <w:tcW w:type="dxa" w:w="2160"/>
+          </w:tcPr>
+          <w:p>
+            <w:r/>
+            <w:r>
+              <w:rPr>
+                <w:sz w:val="17"/>
+              </w:rPr>
+              <w:t>Behind</w:t>
+            </w:r>
+          </w:p>
+        </w:tc>
+      </w:tr>
+      <w:tr>
+        <w:tc>
+          <w:tcPr>
+            <w:tcW w:type="dxa" w:w="2160"/>
+          </w:tcPr>
+          <w:p>
+            <w:r/>
+            <w:r>
+              <w:rPr>
+                <w:sz w:val="17"/>
+              </w:rPr>
+              <w:t>Ticket Size</w:t>
+            </w:r>
+          </w:p>
+        </w:tc>
+        <w:tc>
+          <w:tcPr>
+            <w:tcW w:type="dxa" w:w="2160"/>
+          </w:tcPr>
+          <w:p>
+            <w:r/>
+            <w:r>
+              <w:rPr>
+                <w:sz w:val="17"/>
+              </w:rPr>
+              <w:t>Initiative #9.0 Live (Mar-26)</w:t>
+            </w:r>
+          </w:p>
+        </w:tc>
+        <w:tc>
+          <w:tcPr>
+            <w:tcW w:type="dxa" w:w="2160"/>
+          </w:tcPr>
+          <w:p>
+            <w:r/>
+            <w:r>
+              <w:rPr>
+                <w:sz w:val="17"/>
+              </w:rPr>
+              <w:t>0% realized (Flat); +10% deferred</w:t>
             </w:r>
           </w:p>
         </w:tc>
@@ -2440,7 +2514,7 @@
         <w:rPr>
           <w:b w:val="0"/>
         </w:rPr>
-        <w:t>YTD Disbursement is VNDm 277,174 vs Plan VNDm 339,865 (-18% gap). To hit the FY plan of VNDm 1,879,405, the business must recover the approval rate gap in Q3/Q4 via Initiatives #2.0 and #3.0. Current run-rate suggests a significant shortfall unless the delayed structural initiatives accelerate or the approval rate improves organically.</w:t>
+        <w:t>YTD Disbursement is VNDm 277,174 vs Plan VNDm 339,865 (-18% gap). To hit the FY Plan of VNDm 1,879,405, the business must recover the -5pp Approval Rate gap and realize the deferred impacts of Initiatives #2.0, #3.0, and #10.0 by Q3/Q4. Current run-rate suggests a significant shortfall unless structural unlocks in September materialize fully.</w:t>
       </w:r>
     </w:p>
     <w:p>
@@ -2641,7 +2715,7 @@
               <w:rPr>
                 <w:sz w:val="17"/>
               </w:rPr>
-              <w:t>Oct-26</w:t>
+              <w:t>Sep-26</w:t>
             </w:r>
           </w:p>
         </w:tc>
@@ -2655,7 +2729,7 @@
               <w:rPr>
                 <w:sz w:val="17"/>
               </w:rPr>
-              <w:t>Partner yêu cầu bắt buộc risk-based pricing API, cần thêm 6-8 tuần dev và UAT, timeline khả thi nhất là tháng 10.</w:t>
+              <w:t>Đối tác đồng ý triển khai theo giai đoạn, nhưng cần thêm 2 tuần so với kế hoạch ban đầu (31/8), dự kiến Phase 1 vào tháng 9 với 1 triệu user.</w:t>
             </w:r>
           </w:p>
         </w:tc>
@@ -2741,7 +2815,7 @@
               <w:rPr>
                 <w:sz w:val="17"/>
               </w:rPr>
-              <w:t>Do team Cashier full load và performance test chưa ổn định, hai bên đồng ý deprioritize và sẽ quay lại trong Q4 khi có resource.</w:t>
+              <w:t>Do team Cashier không có nguồn lực và vấn đề hiệu năng, initiative này đã được đồng ý deprioritize và sẽ xem xét lại vào Q4.</w:t>
             </w:r>
           </w:p>
         </w:tc>
@@ -2827,7 +2901,7 @@
               <w:rPr>
                 <w:sz w:val="17"/>
               </w:rPr>
-              <w:t>Do team DS ưu tiên init optimize model, init này chưa thể scoping ngay, dự kiến kick off cuối tháng 6 và cần 2 tháng để hoàn thiện.</w:t>
+              <w:t>Do team DS ưu tiên tối ưu mô hình dữ liệu, việc scoping bị trì hoãn; dự kiến cần 2 tháng để hoàn thiện sau khi bắt đầu.</w:t>
             </w:r>
           </w:p>
         </w:tc>
@@ -2899,7 +2973,7 @@
               <w:rPr>
                 <w:sz w:val="17"/>
               </w:rPr>
-              <w:t>Q4/2026</w:t>
+              <w:t>Q4-2026</w:t>
             </w:r>
           </w:p>
         </w:tc>
@@ -2913,7 +2987,7 @@
               <w:rPr>
                 <w:sz w:val="17"/>
               </w:rPr>
-              <w:t>Low expected impact (+0.5pp); deprioritized vs higher-impact channel work; may revisit Q4.</w:t>
+              <w:t>Đã được deprioritize do tác động thấp, có thể xem xét lại vào Q4.</w:t>
             </w:r>
           </w:p>
         </w:tc>
@@ -2937,7 +3011,7 @@
         <w:pStyle w:val="ListBullet"/>
       </w:pPr>
       <w:r>
-        <w:t>Initiative #2.0 (Persona 1): Delayed to Oct-26 due to mandatory risk-based pricing API requirements; 6-8 weeks dev/UAT needed. Risk: Approval rate remains below plan for 4+ months.</w:t>
+        <w:t>Initiative #2.0 (Persona 1): Delayed to Sep-26; risk of missing Q3 eligible base targets if partner onboarding slips further.</w:t>
       </w:r>
     </w:p>
     <w:p>
@@ -2945,7 +3019,7 @@
         <w:pStyle w:val="ListBullet"/>
       </w:pPr>
       <w:r>
-        <w:t>Initiative #10.0 (Persona 2): Delayed to Aug-26 due to DS team prioritization; risk of missing Q3 submission targets.</w:t>
+        <w:t>Initiative #3.0 (Persona 2): On Track for Sep-26; risk that model optimization (Gini 0.3) does not translate to the expected +15pp eligible base uplift.</w:t>
       </w:r>
     </w:p>
     <w:p>
@@ -2953,7 +3027,7 @@
         <w:pStyle w:val="ListBullet"/>
       </w:pPr>
       <w:r>
-        <w:t>Initiative #12.0 (Persona 3): Year-end campaign not started; creative and budget unconfirmed. Risk: Q4 traffic targets may be missed.</w:t>
+        <w:t>Initiative #10.0 (Persona 2): Delayed to Aug-26 with Low confidence; risk of further slippage impacting Q3 submission rates.</w:t>
       </w:r>
     </w:p>
     <w:p>
@@ -2961,7 +3035,7 @@
         <w:pStyle w:val="ListBullet"/>
       </w:pPr>
       <w:r>
-        <w:t>Initiative #7.0 &amp; #11.0 (Persona 3): Deprioritized due to resource constraints; risk of missing incremental traffic/submission upside in Q4.</w:t>
+        <w:t>Initiative #7.0 &amp; #11.0 (Persona 3): Deprioritized to Q4; risk of permanent loss of +2.5pp traffic/submission potential if Q4 resources are constrained.</w:t>
       </w:r>
     </w:p>
     <w:sectPr>

</xml_diff>